<commit_message>
Standardize resume font and density preference
</commit_message>
<xml_diff>
--- a/assets/examples/anonymized-resume.docx
+++ b/assets/examples/anonymized-resume.docx
@@ -32,7 +32,7 @@
             </w:pPr>
             <w:r>
               <w:rPr>
-                <w:rFonts w:ascii="Arial Unicode MS" w:hAnsi="Arial Unicode MS" w:eastAsia="Arial Unicode MS"/>
+                <w:rFonts w:ascii="Source Han Sans SC" w:hAnsi="Source Han Sans SC" w:eastAsia="Source Han Sans SC"/>
                 <w:b/>
                 <w:color w:val="0E2A44"/>
                 <w:sz w:val="38"/>
@@ -46,7 +46,7 @@
             </w:pPr>
             <w:r>
               <w:rPr>
-                <w:rFonts w:ascii="Arial Unicode MS" w:hAnsi="Arial Unicode MS" w:eastAsia="Arial Unicode MS"/>
+                <w:rFonts w:ascii="Source Han Sans SC" w:hAnsi="Source Han Sans SC" w:eastAsia="Source Han Sans SC"/>
                 <w:b/>
                 <w:color w:val="181818"/>
                 <w:sz w:val="19"/>
@@ -60,7 +60,7 @@
             </w:pPr>
             <w:r>
               <w:rPr>
-                <w:rFonts w:ascii="Arial Unicode MS" w:hAnsi="Arial Unicode MS" w:eastAsia="Arial Unicode MS"/>
+                <w:rFonts w:ascii="Source Han Sans SC" w:hAnsi="Source Han Sans SC" w:eastAsia="Source Han Sans SC"/>
                 <w:b w:val="0"/>
                 <w:color w:val="565656"/>
                 <w:sz w:val="17"/>
@@ -88,7 +88,7 @@
             </w:pPr>
             <w:r>
               <w:rPr>
-                <w:rFonts w:ascii="Arial Unicode MS" w:hAnsi="Arial Unicode MS" w:eastAsia="Arial Unicode MS"/>
+                <w:rFonts w:ascii="Source Han Sans SC" w:hAnsi="Source Han Sans SC" w:eastAsia="Source Han Sans SC"/>
               </w:rPr>
               <w:drawing/>
             </w:r>
@@ -105,7 +105,7 @@
       </w:pPr>
       <w:r>
         <w:rPr>
-          <w:rFonts w:ascii="Arial Unicode MS" w:hAnsi="Arial Unicode MS" w:eastAsia="Arial Unicode MS"/>
+          <w:rFonts w:ascii="Source Han Sans SC" w:hAnsi="Source Han Sans SC" w:eastAsia="Source Han Sans SC"/>
           <w:b/>
           <w:color w:val="2F6F9F"/>
           <w:sz w:val="22"/>
@@ -141,7 +141,7 @@
           <w:p>
             <w:r>
               <w:rPr>
-                <w:rFonts w:ascii="Arial Unicode MS" w:hAnsi="Arial Unicode MS" w:eastAsia="Arial Unicode MS"/>
+                <w:rFonts w:ascii="Source Han Sans SC" w:hAnsi="Source Han Sans SC" w:eastAsia="Source Han Sans SC"/>
                 <w:b/>
                 <w:color w:val="181818"/>
                 <w:sz w:val="18"/>
@@ -169,7 +169,7 @@
             </w:pPr>
             <w:r>
               <w:rPr>
-                <w:rFonts w:ascii="Arial Unicode MS" w:hAnsi="Arial Unicode MS" w:eastAsia="Arial Unicode MS"/>
+                <w:rFonts w:ascii="Source Han Sans SC" w:hAnsi="Source Han Sans SC" w:eastAsia="Source Han Sans SC"/>
                 <w:b/>
                 <w:color w:val="181818"/>
                 <w:sz w:val="18"/>
@@ -197,7 +197,7 @@
             </w:pPr>
             <w:r>
               <w:rPr>
-                <w:rFonts w:ascii="Arial Unicode MS" w:hAnsi="Arial Unicode MS" w:eastAsia="Arial Unicode MS"/>
+                <w:rFonts w:ascii="Source Han Sans SC" w:hAnsi="Source Han Sans SC" w:eastAsia="Source Han Sans SC"/>
                 <w:b w:val="0"/>
                 <w:color w:val="565656"/>
                 <w:sz w:val="17"/>
@@ -216,7 +216,7 @@
       </w:pPr>
       <w:r>
         <w:rPr>
-          <w:rFonts w:ascii="Arial Unicode MS" w:hAnsi="Arial Unicode MS" w:eastAsia="Arial Unicode MS"/>
+          <w:rFonts w:ascii="Source Han Sans SC" w:hAnsi="Source Han Sans SC" w:eastAsia="Source Han Sans SC"/>
           <w:b/>
           <w:color w:val="181818"/>
           <w:sz w:val="17"/>
@@ -225,7 +225,7 @@
       </w:r>
       <w:r>
         <w:rPr>
-          <w:rFonts w:ascii="Arial Unicode MS" w:hAnsi="Arial Unicode MS" w:eastAsia="Arial Unicode MS"/>
+          <w:rFonts w:ascii="Source Han Sans SC" w:hAnsi="Source Han Sans SC" w:eastAsia="Source Han Sans SC"/>
           <w:b w:val="0"/>
           <w:color w:val="181818"/>
           <w:sz w:val="17"/>
@@ -241,7 +241,7 @@
       </w:pPr>
       <w:r>
         <w:rPr>
-          <w:rFonts w:ascii="Arial Unicode MS" w:hAnsi="Arial Unicode MS" w:eastAsia="Arial Unicode MS"/>
+          <w:rFonts w:ascii="Source Han Sans SC" w:hAnsi="Source Han Sans SC" w:eastAsia="Source Han Sans SC"/>
           <w:b/>
           <w:color w:val="181818"/>
           <w:sz w:val="17"/>
@@ -250,7 +250,7 @@
       </w:r>
       <w:r>
         <w:rPr>
-          <w:rFonts w:ascii="Arial Unicode MS" w:hAnsi="Arial Unicode MS" w:eastAsia="Arial Unicode MS"/>
+          <w:rFonts w:ascii="Source Han Sans SC" w:hAnsi="Source Han Sans SC" w:eastAsia="Source Han Sans SC"/>
           <w:b w:val="0"/>
           <w:color w:val="181818"/>
           <w:sz w:val="17"/>
@@ -266,7 +266,7 @@
       </w:pPr>
       <w:r>
         <w:rPr>
-          <w:rFonts w:ascii="Arial Unicode MS" w:hAnsi="Arial Unicode MS" w:eastAsia="Arial Unicode MS"/>
+          <w:rFonts w:ascii="Source Han Sans SC" w:hAnsi="Source Han Sans SC" w:eastAsia="Source Han Sans SC"/>
           <w:b/>
           <w:color w:val="181818"/>
           <w:sz w:val="17"/>
@@ -275,7 +275,7 @@
       </w:r>
       <w:r>
         <w:rPr>
-          <w:rFonts w:ascii="Arial Unicode MS" w:hAnsi="Arial Unicode MS" w:eastAsia="Arial Unicode MS"/>
+          <w:rFonts w:ascii="Source Han Sans SC" w:hAnsi="Source Han Sans SC" w:eastAsia="Source Han Sans SC"/>
           <w:b w:val="0"/>
           <w:color w:val="181818"/>
           <w:sz w:val="17"/>
@@ -292,7 +292,7 @@
       </w:pPr>
       <w:r>
         <w:rPr>
-          <w:rFonts w:ascii="Arial Unicode MS" w:hAnsi="Arial Unicode MS" w:eastAsia="Arial Unicode MS"/>
+          <w:rFonts w:ascii="Source Han Sans SC" w:hAnsi="Source Han Sans SC" w:eastAsia="Source Han Sans SC"/>
           <w:b/>
           <w:color w:val="2F6F9F"/>
           <w:sz w:val="22"/>
@@ -328,7 +328,7 @@
           <w:p>
             <w:r>
               <w:rPr>
-                <w:rFonts w:ascii="Arial Unicode MS" w:hAnsi="Arial Unicode MS" w:eastAsia="Arial Unicode MS"/>
+                <w:rFonts w:ascii="Source Han Sans SC" w:hAnsi="Source Han Sans SC" w:eastAsia="Source Han Sans SC"/>
                 <w:b/>
                 <w:color w:val="181818"/>
                 <w:sz w:val="18"/>
@@ -356,7 +356,7 @@
             </w:pPr>
             <w:r>
               <w:rPr>
-                <w:rFonts w:ascii="Arial Unicode MS" w:hAnsi="Arial Unicode MS" w:eastAsia="Arial Unicode MS"/>
+                <w:rFonts w:ascii="Source Han Sans SC" w:hAnsi="Source Han Sans SC" w:eastAsia="Source Han Sans SC"/>
                 <w:b/>
                 <w:color w:val="181818"/>
                 <w:sz w:val="18"/>
@@ -384,7 +384,7 @@
             </w:pPr>
             <w:r>
               <w:rPr>
-                <w:rFonts w:ascii="Arial Unicode MS" w:hAnsi="Arial Unicode MS" w:eastAsia="Arial Unicode MS"/>
+                <w:rFonts w:ascii="Source Han Sans SC" w:hAnsi="Source Han Sans SC" w:eastAsia="Source Han Sans SC"/>
                 <w:b w:val="0"/>
                 <w:color w:val="565656"/>
                 <w:sz w:val="17"/>
@@ -403,7 +403,7 @@
       </w:pPr>
       <w:r>
         <w:rPr>
-          <w:rFonts w:ascii="Arial Unicode MS" w:hAnsi="Arial Unicode MS" w:eastAsia="Arial Unicode MS"/>
+          <w:rFonts w:ascii="Source Han Sans SC" w:hAnsi="Source Han Sans SC" w:eastAsia="Source Han Sans SC"/>
           <w:b/>
           <w:color w:val="181818"/>
           <w:sz w:val="17"/>
@@ -412,7 +412,7 @@
       </w:r>
       <w:r>
         <w:rPr>
-          <w:rFonts w:ascii="Arial Unicode MS" w:hAnsi="Arial Unicode MS" w:eastAsia="Arial Unicode MS"/>
+          <w:rFonts w:ascii="Source Han Sans SC" w:hAnsi="Source Han Sans SC" w:eastAsia="Source Han Sans SC"/>
           <w:b w:val="0"/>
           <w:color w:val="181818"/>
           <w:sz w:val="17"/>
@@ -428,7 +428,7 @@
       </w:pPr>
       <w:r>
         <w:rPr>
-          <w:rFonts w:ascii="Arial Unicode MS" w:hAnsi="Arial Unicode MS" w:eastAsia="Arial Unicode MS"/>
+          <w:rFonts w:ascii="Source Han Sans SC" w:hAnsi="Source Han Sans SC" w:eastAsia="Source Han Sans SC"/>
           <w:b/>
           <w:color w:val="181818"/>
           <w:sz w:val="17"/>
@@ -437,7 +437,7 @@
       </w:r>
       <w:r>
         <w:rPr>
-          <w:rFonts w:ascii="Arial Unicode MS" w:hAnsi="Arial Unicode MS" w:eastAsia="Arial Unicode MS"/>
+          <w:rFonts w:ascii="Source Han Sans SC" w:hAnsi="Source Han Sans SC" w:eastAsia="Source Han Sans SC"/>
           <w:b w:val="0"/>
           <w:color w:val="181818"/>
           <w:sz w:val="17"/>
@@ -453,7 +453,7 @@
       </w:pPr>
       <w:r>
         <w:rPr>
-          <w:rFonts w:ascii="Arial Unicode MS" w:hAnsi="Arial Unicode MS" w:eastAsia="Arial Unicode MS"/>
+          <w:rFonts w:ascii="Source Han Sans SC" w:hAnsi="Source Han Sans SC" w:eastAsia="Source Han Sans SC"/>
           <w:b/>
           <w:color w:val="181818"/>
           <w:sz w:val="17"/>
@@ -462,7 +462,7 @@
       </w:r>
       <w:r>
         <w:rPr>
-          <w:rFonts w:ascii="Arial Unicode MS" w:hAnsi="Arial Unicode MS" w:eastAsia="Arial Unicode MS"/>
+          <w:rFonts w:ascii="Source Han Sans SC" w:hAnsi="Source Han Sans SC" w:eastAsia="Source Han Sans SC"/>
           <w:b w:val="0"/>
           <w:color w:val="181818"/>
           <w:sz w:val="17"/>
@@ -478,7 +478,7 @@
       </w:pPr>
       <w:r>
         <w:rPr>
-          <w:rFonts w:ascii="Arial Unicode MS" w:hAnsi="Arial Unicode MS" w:eastAsia="Arial Unicode MS"/>
+          <w:rFonts w:ascii="Source Han Sans SC" w:hAnsi="Source Han Sans SC" w:eastAsia="Source Han Sans SC"/>
           <w:b/>
           <w:color w:val="181818"/>
           <w:sz w:val="17"/>
@@ -487,7 +487,7 @@
       </w:r>
       <w:r>
         <w:rPr>
-          <w:rFonts w:ascii="Arial Unicode MS" w:hAnsi="Arial Unicode MS" w:eastAsia="Arial Unicode MS"/>
+          <w:rFonts w:ascii="Source Han Sans SC" w:hAnsi="Source Han Sans SC" w:eastAsia="Source Han Sans SC"/>
           <w:b w:val="0"/>
           <w:color w:val="181818"/>
           <w:sz w:val="17"/>
@@ -503,7 +503,7 @@
       </w:pPr>
       <w:r>
         <w:rPr>
-          <w:rFonts w:ascii="Arial Unicode MS" w:hAnsi="Arial Unicode MS" w:eastAsia="Arial Unicode MS"/>
+          <w:rFonts w:ascii="Source Han Sans SC" w:hAnsi="Source Han Sans SC" w:eastAsia="Source Han Sans SC"/>
           <w:b/>
           <w:color w:val="181818"/>
           <w:sz w:val="17"/>
@@ -512,7 +512,7 @@
       </w:r>
       <w:r>
         <w:rPr>
-          <w:rFonts w:ascii="Arial Unicode MS" w:hAnsi="Arial Unicode MS" w:eastAsia="Arial Unicode MS"/>
+          <w:rFonts w:ascii="Source Han Sans SC" w:hAnsi="Source Han Sans SC" w:eastAsia="Source Han Sans SC"/>
           <w:b w:val="0"/>
           <w:color w:val="181818"/>
           <w:sz w:val="17"/>
@@ -528,7 +528,7 @@
       </w:pPr>
       <w:r>
         <w:rPr>
-          <w:rFonts w:ascii="Arial Unicode MS" w:hAnsi="Arial Unicode MS" w:eastAsia="Arial Unicode MS"/>
+          <w:rFonts w:ascii="Source Han Sans SC" w:hAnsi="Source Han Sans SC" w:eastAsia="Source Han Sans SC"/>
           <w:b/>
           <w:color w:val="181818"/>
           <w:sz w:val="17"/>
@@ -537,7 +537,7 @@
       </w:r>
       <w:r>
         <w:rPr>
-          <w:rFonts w:ascii="Arial Unicode MS" w:hAnsi="Arial Unicode MS" w:eastAsia="Arial Unicode MS"/>
+          <w:rFonts w:ascii="Source Han Sans SC" w:hAnsi="Source Han Sans SC" w:eastAsia="Source Han Sans SC"/>
           <w:b w:val="0"/>
           <w:color w:val="181818"/>
           <w:sz w:val="17"/>
@@ -553,7 +553,7 @@
       </w:pPr>
       <w:r>
         <w:rPr>
-          <w:rFonts w:ascii="Arial Unicode MS" w:hAnsi="Arial Unicode MS" w:eastAsia="Arial Unicode MS"/>
+          <w:rFonts w:ascii="Source Han Sans SC" w:hAnsi="Source Han Sans SC" w:eastAsia="Source Han Sans SC"/>
           <w:b/>
           <w:color w:val="181818"/>
           <w:sz w:val="17"/>
@@ -562,7 +562,7 @@
       </w:r>
       <w:r>
         <w:rPr>
-          <w:rFonts w:ascii="Arial Unicode MS" w:hAnsi="Arial Unicode MS" w:eastAsia="Arial Unicode MS"/>
+          <w:rFonts w:ascii="Source Han Sans SC" w:hAnsi="Source Han Sans SC" w:eastAsia="Source Han Sans SC"/>
           <w:b w:val="0"/>
           <w:color w:val="181818"/>
           <w:sz w:val="17"/>
@@ -598,7 +598,7 @@
           <w:p>
             <w:r>
               <w:rPr>
-                <w:rFonts w:ascii="Arial Unicode MS" w:hAnsi="Arial Unicode MS" w:eastAsia="Arial Unicode MS"/>
+                <w:rFonts w:ascii="Source Han Sans SC" w:hAnsi="Source Han Sans SC" w:eastAsia="Source Han Sans SC"/>
                 <w:b/>
                 <w:color w:val="181818"/>
                 <w:sz w:val="18"/>
@@ -626,7 +626,7 @@
             </w:pPr>
             <w:r>
               <w:rPr>
-                <w:rFonts w:ascii="Arial Unicode MS" w:hAnsi="Arial Unicode MS" w:eastAsia="Arial Unicode MS"/>
+                <w:rFonts w:ascii="Source Han Sans SC" w:hAnsi="Source Han Sans SC" w:eastAsia="Source Han Sans SC"/>
                 <w:b/>
                 <w:color w:val="181818"/>
                 <w:sz w:val="18"/>
@@ -654,7 +654,7 @@
             </w:pPr>
             <w:r>
               <w:rPr>
-                <w:rFonts w:ascii="Arial Unicode MS" w:hAnsi="Arial Unicode MS" w:eastAsia="Arial Unicode MS"/>
+                <w:rFonts w:ascii="Source Han Sans SC" w:hAnsi="Source Han Sans SC" w:eastAsia="Source Han Sans SC"/>
                 <w:b w:val="0"/>
                 <w:color w:val="565656"/>
                 <w:sz w:val="17"/>
@@ -673,7 +673,7 @@
       </w:pPr>
       <w:r>
         <w:rPr>
-          <w:rFonts w:ascii="Arial Unicode MS" w:hAnsi="Arial Unicode MS" w:eastAsia="Arial Unicode MS"/>
+          <w:rFonts w:ascii="Source Han Sans SC" w:hAnsi="Source Han Sans SC" w:eastAsia="Source Han Sans SC"/>
           <w:b/>
           <w:color w:val="181818"/>
           <w:sz w:val="17"/>
@@ -682,7 +682,7 @@
       </w:r>
       <w:r>
         <w:rPr>
-          <w:rFonts w:ascii="Arial Unicode MS" w:hAnsi="Arial Unicode MS" w:eastAsia="Arial Unicode MS"/>
+          <w:rFonts w:ascii="Source Han Sans SC" w:hAnsi="Source Han Sans SC" w:eastAsia="Source Han Sans SC"/>
           <w:b w:val="0"/>
           <w:color w:val="181818"/>
           <w:sz w:val="17"/>
@@ -698,7 +698,7 @@
       </w:pPr>
       <w:r>
         <w:rPr>
-          <w:rFonts w:ascii="Arial Unicode MS" w:hAnsi="Arial Unicode MS" w:eastAsia="Arial Unicode MS"/>
+          <w:rFonts w:ascii="Source Han Sans SC" w:hAnsi="Source Han Sans SC" w:eastAsia="Source Han Sans SC"/>
           <w:b/>
           <w:color w:val="181818"/>
           <w:sz w:val="17"/>
@@ -707,7 +707,7 @@
       </w:r>
       <w:r>
         <w:rPr>
-          <w:rFonts w:ascii="Arial Unicode MS" w:hAnsi="Arial Unicode MS" w:eastAsia="Arial Unicode MS"/>
+          <w:rFonts w:ascii="Source Han Sans SC" w:hAnsi="Source Han Sans SC" w:eastAsia="Source Han Sans SC"/>
           <w:b w:val="0"/>
           <w:color w:val="181818"/>
           <w:sz w:val="17"/>
@@ -723,7 +723,7 @@
       </w:pPr>
       <w:r>
         <w:rPr>
-          <w:rFonts w:ascii="Arial Unicode MS" w:hAnsi="Arial Unicode MS" w:eastAsia="Arial Unicode MS"/>
+          <w:rFonts w:ascii="Source Han Sans SC" w:hAnsi="Source Han Sans SC" w:eastAsia="Source Han Sans SC"/>
           <w:b/>
           <w:color w:val="181818"/>
           <w:sz w:val="17"/>
@@ -732,7 +732,7 @@
       </w:r>
       <w:r>
         <w:rPr>
-          <w:rFonts w:ascii="Arial Unicode MS" w:hAnsi="Arial Unicode MS" w:eastAsia="Arial Unicode MS"/>
+          <w:rFonts w:ascii="Source Han Sans SC" w:hAnsi="Source Han Sans SC" w:eastAsia="Source Han Sans SC"/>
           <w:b w:val="0"/>
           <w:color w:val="181818"/>
           <w:sz w:val="17"/>
@@ -748,7 +748,7 @@
       </w:pPr>
       <w:r>
         <w:rPr>
-          <w:rFonts w:ascii="Arial Unicode MS" w:hAnsi="Arial Unicode MS" w:eastAsia="Arial Unicode MS"/>
+          <w:rFonts w:ascii="Source Han Sans SC" w:hAnsi="Source Han Sans SC" w:eastAsia="Source Han Sans SC"/>
           <w:b/>
           <w:color w:val="181818"/>
           <w:sz w:val="17"/>
@@ -757,7 +757,7 @@
       </w:r>
       <w:r>
         <w:rPr>
-          <w:rFonts w:ascii="Arial Unicode MS" w:hAnsi="Arial Unicode MS" w:eastAsia="Arial Unicode MS"/>
+          <w:rFonts w:ascii="Source Han Sans SC" w:hAnsi="Source Han Sans SC" w:eastAsia="Source Han Sans SC"/>
           <w:b w:val="0"/>
           <w:color w:val="181818"/>
           <w:sz w:val="17"/>
@@ -793,7 +793,7 @@
           <w:p>
             <w:r>
               <w:rPr>
-                <w:rFonts w:ascii="Arial Unicode MS" w:hAnsi="Arial Unicode MS" w:eastAsia="Arial Unicode MS"/>
+                <w:rFonts w:ascii="Source Han Sans SC" w:hAnsi="Source Han Sans SC" w:eastAsia="Source Han Sans SC"/>
                 <w:b/>
                 <w:color w:val="181818"/>
                 <w:sz w:val="18"/>
@@ -821,7 +821,7 @@
             </w:pPr>
             <w:r>
               <w:rPr>
-                <w:rFonts w:ascii="Arial Unicode MS" w:hAnsi="Arial Unicode MS" w:eastAsia="Arial Unicode MS"/>
+                <w:rFonts w:ascii="Source Han Sans SC" w:hAnsi="Source Han Sans SC" w:eastAsia="Source Han Sans SC"/>
                 <w:b/>
                 <w:color w:val="181818"/>
                 <w:sz w:val="18"/>
@@ -849,7 +849,7 @@
             </w:pPr>
             <w:r>
               <w:rPr>
-                <w:rFonts w:ascii="Arial Unicode MS" w:hAnsi="Arial Unicode MS" w:eastAsia="Arial Unicode MS"/>
+                <w:rFonts w:ascii="Source Han Sans SC" w:hAnsi="Source Han Sans SC" w:eastAsia="Source Han Sans SC"/>
                 <w:b w:val="0"/>
                 <w:color w:val="565656"/>
                 <w:sz w:val="17"/>
@@ -868,7 +868,7 @@
       </w:pPr>
       <w:r>
         <w:rPr>
-          <w:rFonts w:ascii="Arial Unicode MS" w:hAnsi="Arial Unicode MS" w:eastAsia="Arial Unicode MS"/>
+          <w:rFonts w:ascii="Source Han Sans SC" w:hAnsi="Source Han Sans SC" w:eastAsia="Source Han Sans SC"/>
           <w:b/>
           <w:color w:val="181818"/>
           <w:sz w:val="17"/>
@@ -877,7 +877,7 @@
       </w:r>
       <w:r>
         <w:rPr>
-          <w:rFonts w:ascii="Arial Unicode MS" w:hAnsi="Arial Unicode MS" w:eastAsia="Arial Unicode MS"/>
+          <w:rFonts w:ascii="Source Han Sans SC" w:hAnsi="Source Han Sans SC" w:eastAsia="Source Han Sans SC"/>
           <w:b w:val="0"/>
           <w:color w:val="181818"/>
           <w:sz w:val="17"/>
@@ -893,7 +893,7 @@
       </w:pPr>
       <w:r>
         <w:rPr>
-          <w:rFonts w:ascii="Arial Unicode MS" w:hAnsi="Arial Unicode MS" w:eastAsia="Arial Unicode MS"/>
+          <w:rFonts w:ascii="Source Han Sans SC" w:hAnsi="Source Han Sans SC" w:eastAsia="Source Han Sans SC"/>
           <w:b/>
           <w:color w:val="181818"/>
           <w:sz w:val="17"/>
@@ -902,7 +902,7 @@
       </w:r>
       <w:r>
         <w:rPr>
-          <w:rFonts w:ascii="Arial Unicode MS" w:hAnsi="Arial Unicode MS" w:eastAsia="Arial Unicode MS"/>
+          <w:rFonts w:ascii="Source Han Sans SC" w:hAnsi="Source Han Sans SC" w:eastAsia="Source Han Sans SC"/>
           <w:b w:val="0"/>
           <w:color w:val="181818"/>
           <w:sz w:val="17"/>
@@ -918,7 +918,7 @@
       </w:pPr>
       <w:r>
         <w:rPr>
-          <w:rFonts w:ascii="Arial Unicode MS" w:hAnsi="Arial Unicode MS" w:eastAsia="Arial Unicode MS"/>
+          <w:rFonts w:ascii="Source Han Sans SC" w:hAnsi="Source Han Sans SC" w:eastAsia="Source Han Sans SC"/>
           <w:b/>
           <w:color w:val="181818"/>
           <w:sz w:val="17"/>
@@ -927,7 +927,7 @@
       </w:r>
       <w:r>
         <w:rPr>
-          <w:rFonts w:ascii="Arial Unicode MS" w:hAnsi="Arial Unicode MS" w:eastAsia="Arial Unicode MS"/>
+          <w:rFonts w:ascii="Source Han Sans SC" w:hAnsi="Source Han Sans SC" w:eastAsia="Source Han Sans SC"/>
           <w:b w:val="0"/>
           <w:color w:val="181818"/>
           <w:sz w:val="17"/>
@@ -943,7 +943,7 @@
       </w:pPr>
       <w:r>
         <w:rPr>
-          <w:rFonts w:ascii="Arial Unicode MS" w:hAnsi="Arial Unicode MS" w:eastAsia="Arial Unicode MS"/>
+          <w:rFonts w:ascii="Source Han Sans SC" w:hAnsi="Source Han Sans SC" w:eastAsia="Source Han Sans SC"/>
           <w:b/>
           <w:color w:val="181818"/>
           <w:sz w:val="17"/>
@@ -952,7 +952,7 @@
       </w:r>
       <w:r>
         <w:rPr>
-          <w:rFonts w:ascii="Arial Unicode MS" w:hAnsi="Arial Unicode MS" w:eastAsia="Arial Unicode MS"/>
+          <w:rFonts w:ascii="Source Han Sans SC" w:hAnsi="Source Han Sans SC" w:eastAsia="Source Han Sans SC"/>
           <w:b w:val="0"/>
           <w:color w:val="181818"/>
           <w:sz w:val="17"/>
@@ -969,7 +969,7 @@
       </w:pPr>
       <w:r>
         <w:rPr>
-          <w:rFonts w:ascii="Arial Unicode MS" w:hAnsi="Arial Unicode MS" w:eastAsia="Arial Unicode MS"/>
+          <w:rFonts w:ascii="Source Han Sans SC" w:hAnsi="Source Han Sans SC" w:eastAsia="Source Han Sans SC"/>
           <w:b/>
           <w:color w:val="2F6F9F"/>
           <w:sz w:val="22"/>
@@ -1005,7 +1005,7 @@
           <w:p>
             <w:r>
               <w:rPr>
-                <w:rFonts w:ascii="Arial Unicode MS" w:hAnsi="Arial Unicode MS" w:eastAsia="Arial Unicode MS"/>
+                <w:rFonts w:ascii="Source Han Sans SC" w:hAnsi="Source Han Sans SC" w:eastAsia="Source Han Sans SC"/>
                 <w:b/>
                 <w:color w:val="181818"/>
                 <w:sz w:val="18"/>
@@ -1033,7 +1033,7 @@
             </w:pPr>
             <w:r>
               <w:rPr>
-                <w:rFonts w:ascii="Arial Unicode MS" w:hAnsi="Arial Unicode MS" w:eastAsia="Arial Unicode MS"/>
+                <w:rFonts w:ascii="Source Han Sans SC" w:hAnsi="Source Han Sans SC" w:eastAsia="Source Han Sans SC"/>
                 <w:b/>
                 <w:color w:val="181818"/>
                 <w:sz w:val="18"/>
@@ -1061,7 +1061,7 @@
             </w:pPr>
             <w:r>
               <w:rPr>
-                <w:rFonts w:ascii="Arial Unicode MS" w:hAnsi="Arial Unicode MS" w:eastAsia="Arial Unicode MS"/>
+                <w:rFonts w:ascii="Source Han Sans SC" w:hAnsi="Source Han Sans SC" w:eastAsia="Source Han Sans SC"/>
                 <w:b w:val="0"/>
                 <w:color w:val="565656"/>
                 <w:sz w:val="17"/>
@@ -1080,7 +1080,7 @@
       </w:pPr>
       <w:r>
         <w:rPr>
-          <w:rFonts w:ascii="Arial Unicode MS" w:hAnsi="Arial Unicode MS" w:eastAsia="Arial Unicode MS"/>
+          <w:rFonts w:ascii="Source Han Sans SC" w:hAnsi="Source Han Sans SC" w:eastAsia="Source Han Sans SC"/>
           <w:b/>
           <w:color w:val="181818"/>
           <w:sz w:val="17"/>
@@ -1089,7 +1089,7 @@
       </w:r>
       <w:r>
         <w:rPr>
-          <w:rFonts w:ascii="Arial Unicode MS" w:hAnsi="Arial Unicode MS" w:eastAsia="Arial Unicode MS"/>
+          <w:rFonts w:ascii="Source Han Sans SC" w:hAnsi="Source Han Sans SC" w:eastAsia="Source Han Sans SC"/>
           <w:b w:val="0"/>
           <w:color w:val="181818"/>
           <w:sz w:val="17"/>
@@ -1105,7 +1105,7 @@
       </w:pPr>
       <w:r>
         <w:rPr>
-          <w:rFonts w:ascii="Arial Unicode MS" w:hAnsi="Arial Unicode MS" w:eastAsia="Arial Unicode MS"/>
+          <w:rFonts w:ascii="Source Han Sans SC" w:hAnsi="Source Han Sans SC" w:eastAsia="Source Han Sans SC"/>
           <w:b/>
           <w:color w:val="181818"/>
           <w:sz w:val="17"/>
@@ -1114,7 +1114,7 @@
       </w:r>
       <w:r>
         <w:rPr>
-          <w:rFonts w:ascii="Arial Unicode MS" w:hAnsi="Arial Unicode MS" w:eastAsia="Arial Unicode MS"/>
+          <w:rFonts w:ascii="Source Han Sans SC" w:hAnsi="Source Han Sans SC" w:eastAsia="Source Han Sans SC"/>
           <w:b w:val="0"/>
           <w:color w:val="181818"/>
           <w:sz w:val="17"/>
@@ -1131,7 +1131,7 @@
       </w:pPr>
       <w:r>
         <w:rPr>
-          <w:rFonts w:ascii="Arial Unicode MS" w:hAnsi="Arial Unicode MS" w:eastAsia="Arial Unicode MS"/>
+          <w:rFonts w:ascii="Source Han Sans SC" w:hAnsi="Source Han Sans SC" w:eastAsia="Source Han Sans SC"/>
           <w:b/>
           <w:color w:val="2F6F9F"/>
           <w:sz w:val="22"/>
@@ -1147,7 +1147,7 @@
       </w:pPr>
       <w:r>
         <w:rPr>
-          <w:rFonts w:ascii="Arial Unicode MS" w:hAnsi="Arial Unicode MS" w:eastAsia="Arial Unicode MS"/>
+          <w:rFonts w:ascii="Source Han Sans SC" w:hAnsi="Source Han Sans SC" w:eastAsia="Source Han Sans SC"/>
           <w:b/>
           <w:color w:val="181818"/>
           <w:sz w:val="17"/>
@@ -1156,7 +1156,7 @@
       </w:r>
       <w:r>
         <w:rPr>
-          <w:rFonts w:ascii="Arial Unicode MS" w:hAnsi="Arial Unicode MS" w:eastAsia="Arial Unicode MS"/>
+          <w:rFonts w:ascii="Source Han Sans SC" w:hAnsi="Source Han Sans SC" w:eastAsia="Source Han Sans SC"/>
           <w:b w:val="0"/>
           <w:color w:val="181818"/>
           <w:sz w:val="17"/>
@@ -1172,7 +1172,7 @@
       </w:pPr>
       <w:r>
         <w:rPr>
-          <w:rFonts w:ascii="Arial Unicode MS" w:hAnsi="Arial Unicode MS" w:eastAsia="Arial Unicode MS"/>
+          <w:rFonts w:ascii="Source Han Sans SC" w:hAnsi="Source Han Sans SC" w:eastAsia="Source Han Sans SC"/>
           <w:b/>
           <w:color w:val="181818"/>
           <w:sz w:val="17"/>
@@ -1181,7 +1181,7 @@
       </w:r>
       <w:r>
         <w:rPr>
-          <w:rFonts w:ascii="Arial Unicode MS" w:hAnsi="Arial Unicode MS" w:eastAsia="Arial Unicode MS"/>
+          <w:rFonts w:ascii="Source Han Sans SC" w:hAnsi="Source Han Sans SC" w:eastAsia="Source Han Sans SC"/>
           <w:b w:val="0"/>
           <w:color w:val="181818"/>
           <w:sz w:val="17"/>
@@ -1197,7 +1197,7 @@
       </w:pPr>
       <w:r>
         <w:rPr>
-          <w:rFonts w:ascii="Arial Unicode MS" w:hAnsi="Arial Unicode MS" w:eastAsia="Arial Unicode MS"/>
+          <w:rFonts w:ascii="Source Han Sans SC" w:hAnsi="Source Han Sans SC" w:eastAsia="Source Han Sans SC"/>
           <w:b/>
           <w:color w:val="181818"/>
           <w:sz w:val="17"/>
@@ -1206,7 +1206,7 @@
       </w:r>
       <w:r>
         <w:rPr>
-          <w:rFonts w:ascii="Arial Unicode MS" w:hAnsi="Arial Unicode MS" w:eastAsia="Arial Unicode MS"/>
+          <w:rFonts w:ascii="Source Han Sans SC" w:hAnsi="Source Han Sans SC" w:eastAsia="Source Han Sans SC"/>
           <w:b w:val="0"/>
           <w:color w:val="181818"/>
           <w:sz w:val="17"/>
@@ -1222,7 +1222,7 @@
       </w:pPr>
       <w:r>
         <w:rPr>
-          <w:rFonts w:ascii="Arial Unicode MS" w:hAnsi="Arial Unicode MS" w:eastAsia="Arial Unicode MS"/>
+          <w:rFonts w:ascii="Source Han Sans SC" w:hAnsi="Source Han Sans SC" w:eastAsia="Source Han Sans SC"/>
           <w:b/>
           <w:color w:val="181818"/>
           <w:sz w:val="17"/>
@@ -1231,7 +1231,7 @@
       </w:r>
       <w:r>
         <w:rPr>
-          <w:rFonts w:ascii="Arial Unicode MS" w:hAnsi="Arial Unicode MS" w:eastAsia="Arial Unicode MS"/>
+          <w:rFonts w:ascii="Source Han Sans SC" w:hAnsi="Source Han Sans SC" w:eastAsia="Source Han Sans SC"/>
           <w:b w:val="0"/>
           <w:color w:val="181818"/>
           <w:sz w:val="17"/>
@@ -1248,7 +1248,7 @@
       </w:pPr>
       <w:r>
         <w:rPr>
-          <w:rFonts w:ascii="Arial Unicode MS" w:hAnsi="Arial Unicode MS" w:eastAsia="Arial Unicode MS"/>
+          <w:rFonts w:ascii="Source Han Sans SC" w:hAnsi="Source Han Sans SC" w:eastAsia="Source Han Sans SC"/>
           <w:b/>
           <w:color w:val="2F6F9F"/>
           <w:sz w:val="22"/>
@@ -1264,7 +1264,7 @@
       </w:pPr>
       <w:r>
         <w:rPr>
-          <w:rFonts w:ascii="Arial Unicode MS" w:hAnsi="Arial Unicode MS" w:eastAsia="Arial Unicode MS"/>
+          <w:rFonts w:ascii="Source Han Sans SC" w:hAnsi="Source Han Sans SC" w:eastAsia="Source Han Sans SC"/>
           <w:b w:val="0"/>
           <w:color w:val="181818"/>
           <w:sz w:val="17"/>
@@ -1280,7 +1280,7 @@
       </w:pPr>
       <w:r>
         <w:rPr>
-          <w:rFonts w:ascii="Arial Unicode MS" w:hAnsi="Arial Unicode MS" w:eastAsia="Arial Unicode MS"/>
+          <w:rFonts w:ascii="Source Han Sans SC" w:hAnsi="Source Han Sans SC" w:eastAsia="Source Han Sans SC"/>
           <w:b w:val="0"/>
           <w:color w:val="181818"/>
           <w:sz w:val="17"/>
@@ -1297,7 +1297,7 @@
       </w:pPr>
       <w:r>
         <w:rPr>
-          <w:rFonts w:ascii="Arial Unicode MS" w:hAnsi="Arial Unicode MS" w:eastAsia="Arial Unicode MS"/>
+          <w:rFonts w:ascii="Source Han Sans SC" w:hAnsi="Source Han Sans SC" w:eastAsia="Source Han Sans SC"/>
           <w:b/>
           <w:color w:val="2F6F9F"/>
           <w:sz w:val="22"/>
@@ -1313,7 +1313,7 @@
       </w:pPr>
       <w:r>
         <w:rPr>
-          <w:rFonts w:ascii="Arial Unicode MS" w:hAnsi="Arial Unicode MS" w:eastAsia="Arial Unicode MS"/>
+          <w:rFonts w:ascii="Source Han Sans SC" w:hAnsi="Source Han Sans SC" w:eastAsia="Source Han Sans SC"/>
           <w:b/>
           <w:color w:val="181818"/>
           <w:sz w:val="17"/>
@@ -1322,7 +1322,7 @@
       </w:r>
       <w:r>
         <w:rPr>
-          <w:rFonts w:ascii="Arial Unicode MS" w:hAnsi="Arial Unicode MS" w:eastAsia="Arial Unicode MS"/>
+          <w:rFonts w:ascii="Source Han Sans SC" w:hAnsi="Source Han Sans SC" w:eastAsia="Source Han Sans SC"/>
           <w:b w:val="0"/>
           <w:color w:val="181818"/>
           <w:sz w:val="17"/>
@@ -1338,7 +1338,7 @@
       </w:pPr>
       <w:r>
         <w:rPr>
-          <w:rFonts w:ascii="Arial Unicode MS" w:hAnsi="Arial Unicode MS" w:eastAsia="Arial Unicode MS"/>
+          <w:rFonts w:ascii="Source Han Sans SC" w:hAnsi="Source Han Sans SC" w:eastAsia="Source Han Sans SC"/>
           <w:b/>
           <w:color w:val="181818"/>
           <w:sz w:val="17"/>
@@ -1347,7 +1347,7 @@
       </w:r>
       <w:r>
         <w:rPr>
-          <w:rFonts w:ascii="Arial Unicode MS" w:hAnsi="Arial Unicode MS" w:eastAsia="Arial Unicode MS"/>
+          <w:rFonts w:ascii="Source Han Sans SC" w:hAnsi="Source Han Sans SC" w:eastAsia="Source Han Sans SC"/>
           <w:b w:val="0"/>
           <w:color w:val="181818"/>
           <w:sz w:val="17"/>
@@ -1363,7 +1363,7 @@
       </w:pPr>
       <w:r>
         <w:rPr>
-          <w:rFonts w:ascii="Arial Unicode MS" w:hAnsi="Arial Unicode MS" w:eastAsia="Arial Unicode MS"/>
+          <w:rFonts w:ascii="Source Han Sans SC" w:hAnsi="Source Han Sans SC" w:eastAsia="Source Han Sans SC"/>
           <w:b/>
           <w:color w:val="181818"/>
           <w:sz w:val="17"/>
@@ -1372,7 +1372,7 @@
       </w:r>
       <w:r>
         <w:rPr>
-          <w:rFonts w:ascii="Arial Unicode MS" w:hAnsi="Arial Unicode MS" w:eastAsia="Arial Unicode MS"/>
+          <w:rFonts w:ascii="Source Han Sans SC" w:hAnsi="Source Han Sans SC" w:eastAsia="Source Han Sans SC"/>
           <w:b w:val="0"/>
           <w:color w:val="181818"/>
           <w:sz w:val="17"/>
@@ -1388,7 +1388,7 @@
       </w:pPr>
       <w:r>
         <w:rPr>
-          <w:rFonts w:ascii="Arial Unicode MS" w:hAnsi="Arial Unicode MS" w:eastAsia="Arial Unicode MS"/>
+          <w:rFonts w:ascii="Source Han Sans SC" w:hAnsi="Source Han Sans SC" w:eastAsia="Source Han Sans SC"/>
           <w:b/>
           <w:color w:val="181818"/>
           <w:sz w:val="17"/>
@@ -1397,7 +1397,7 @@
       </w:r>
       <w:r>
         <w:rPr>
-          <w:rFonts w:ascii="Arial Unicode MS" w:hAnsi="Arial Unicode MS" w:eastAsia="Arial Unicode MS"/>
+          <w:rFonts w:ascii="Source Han Sans SC" w:hAnsi="Source Han Sans SC" w:eastAsia="Source Han Sans SC"/>
           <w:b w:val="0"/>
           <w:color w:val="181818"/>
           <w:sz w:val="17"/>
@@ -1801,7 +1801,7 @@
     <w:qFormat/>
     <w:rsid w:val="00FC693F"/>
     <w:rPr>
-      <w:rFonts w:ascii="Arial Unicode MS" w:hAnsi="Arial Unicode MS" w:eastAsia="Arial Unicode MS"/>
+      <w:rFonts w:ascii="Source Han Sans SC" w:hAnsi="Source Han Sans SC" w:eastAsia="Source Han Sans SC"/>
       <w:sz w:val="17"/>
     </w:rPr>
   </w:style>
@@ -1820,7 +1820,7 @@
       <w:spacing w:after="0" w:line="240" w:lineRule="auto"/>
     </w:pPr>
     <w:rPr>
-      <w:rFonts w:ascii="Arial Unicode MS" w:hAnsi="Arial Unicode MS" w:eastAsia="Arial Unicode MS"/>
+      <w:rFonts w:ascii="Source Han Sans SC" w:hAnsi="Source Han Sans SC" w:eastAsia="Source Han Sans SC"/>
     </w:rPr>
   </w:style>
   <w:style w:type="character" w:customStyle="1" w:styleId="HeaderChar">
@@ -1830,7 +1830,7 @@
     <w:uiPriority w:val="99"/>
     <w:rsid w:val="00E618BF"/>
     <w:rPr>
-      <w:rFonts w:ascii="Arial Unicode MS" w:hAnsi="Arial Unicode MS" w:eastAsia="Arial Unicode MS"/>
+      <w:rFonts w:ascii="Source Han Sans SC" w:hAnsi="Source Han Sans SC" w:eastAsia="Source Han Sans SC"/>
     </w:rPr>
   </w:style>
   <w:style w:type="paragraph" w:styleId="Footer">
@@ -1848,7 +1848,7 @@
       <w:spacing w:after="0" w:line="240" w:lineRule="auto"/>
     </w:pPr>
     <w:rPr>
-      <w:rFonts w:ascii="Arial Unicode MS" w:hAnsi="Arial Unicode MS" w:eastAsia="Arial Unicode MS"/>
+      <w:rFonts w:ascii="Source Han Sans SC" w:hAnsi="Source Han Sans SC" w:eastAsia="Source Han Sans SC"/>
     </w:rPr>
   </w:style>
   <w:style w:type="character" w:customStyle="1" w:styleId="FooterChar">
@@ -1858,7 +1858,7 @@
     <w:uiPriority w:val="99"/>
     <w:rsid w:val="00E618BF"/>
     <w:rPr>
-      <w:rFonts w:ascii="Arial Unicode MS" w:hAnsi="Arial Unicode MS" w:eastAsia="Arial Unicode MS"/>
+      <w:rFonts w:ascii="Source Han Sans SC" w:hAnsi="Source Han Sans SC" w:eastAsia="Source Han Sans SC"/>
     </w:rPr>
   </w:style>
   <w:style w:type="paragraph" w:styleId="Heading1">
@@ -1876,7 +1876,7 @@
       <w:outlineLvl w:val="0"/>
     </w:pPr>
     <w:rPr>
-      <w:rFonts w:asciiTheme="majorHAnsi" w:eastAsiaTheme="majorEastAsia" w:hAnsiTheme="majorHAnsi" w:cstheme="majorBidi" w:ascii="Arial Unicode MS" w:hAnsi="Arial Unicode MS" w:eastAsia="Arial Unicode MS"/>
+      <w:rFonts w:asciiTheme="majorHAnsi" w:eastAsiaTheme="majorEastAsia" w:hAnsiTheme="majorHAnsi" w:cstheme="majorBidi" w:ascii="Source Han Sans SC" w:hAnsi="Source Han Sans SC" w:eastAsia="Source Han Sans SC"/>
       <w:b/>
       <w:bCs/>
       <w:color w:val="365F91" w:themeColor="accent1" w:themeShade="BF"/>
@@ -1900,7 +1900,7 @@
       <w:outlineLvl w:val="1"/>
     </w:pPr>
     <w:rPr>
-      <w:rFonts w:asciiTheme="majorHAnsi" w:eastAsiaTheme="majorEastAsia" w:hAnsiTheme="majorHAnsi" w:cstheme="majorBidi" w:ascii="Arial Unicode MS" w:hAnsi="Arial Unicode MS" w:eastAsia="Arial Unicode MS"/>
+      <w:rFonts w:asciiTheme="majorHAnsi" w:eastAsiaTheme="majorEastAsia" w:hAnsiTheme="majorHAnsi" w:cstheme="majorBidi" w:ascii="Source Han Sans SC" w:hAnsi="Source Han Sans SC" w:eastAsia="Source Han Sans SC"/>
       <w:b/>
       <w:bCs/>
       <w:color w:val="4F81BD" w:themeColor="accent1"/>
@@ -1924,7 +1924,7 @@
       <w:outlineLvl w:val="2"/>
     </w:pPr>
     <w:rPr>
-      <w:rFonts w:asciiTheme="majorHAnsi" w:eastAsiaTheme="majorEastAsia" w:hAnsiTheme="majorHAnsi" w:cstheme="majorBidi" w:ascii="Arial Unicode MS" w:hAnsi="Arial Unicode MS" w:eastAsia="Arial Unicode MS"/>
+      <w:rFonts w:asciiTheme="majorHAnsi" w:eastAsiaTheme="majorEastAsia" w:hAnsiTheme="majorHAnsi" w:cstheme="majorBidi" w:ascii="Source Han Sans SC" w:hAnsi="Source Han Sans SC" w:eastAsia="Source Han Sans SC"/>
       <w:b/>
       <w:bCs/>
       <w:color w:val="4F81BD" w:themeColor="accent1"/>
@@ -1947,7 +1947,7 @@
       <w:outlineLvl w:val="3"/>
     </w:pPr>
     <w:rPr>
-      <w:rFonts w:asciiTheme="majorHAnsi" w:eastAsiaTheme="majorEastAsia" w:hAnsiTheme="majorHAnsi" w:cstheme="majorBidi" w:ascii="Arial Unicode MS" w:hAnsi="Arial Unicode MS" w:eastAsia="Arial Unicode MS"/>
+      <w:rFonts w:asciiTheme="majorHAnsi" w:eastAsiaTheme="majorEastAsia" w:hAnsiTheme="majorHAnsi" w:cstheme="majorBidi" w:ascii="Source Han Sans SC" w:hAnsi="Source Han Sans SC" w:eastAsia="Source Han Sans SC"/>
       <w:b/>
       <w:bCs/>
       <w:i/>
@@ -1972,7 +1972,7 @@
       <w:outlineLvl w:val="4"/>
     </w:pPr>
     <w:rPr>
-      <w:rFonts w:asciiTheme="majorHAnsi" w:eastAsiaTheme="majorEastAsia" w:hAnsiTheme="majorHAnsi" w:cstheme="majorBidi" w:ascii="Arial Unicode MS" w:hAnsi="Arial Unicode MS" w:eastAsia="Arial Unicode MS"/>
+      <w:rFonts w:asciiTheme="majorHAnsi" w:eastAsiaTheme="majorEastAsia" w:hAnsiTheme="majorHAnsi" w:cstheme="majorBidi" w:ascii="Source Han Sans SC" w:hAnsi="Source Han Sans SC" w:eastAsia="Source Han Sans SC"/>
       <w:color w:val="243F60" w:themeColor="accent1" w:themeShade="7F"/>
     </w:rPr>
   </w:style>
@@ -1993,7 +1993,7 @@
       <w:outlineLvl w:val="5"/>
     </w:pPr>
     <w:rPr>
-      <w:rFonts w:asciiTheme="majorHAnsi" w:eastAsiaTheme="majorEastAsia" w:hAnsiTheme="majorHAnsi" w:cstheme="majorBidi" w:ascii="Arial Unicode MS" w:hAnsi="Arial Unicode MS" w:eastAsia="Arial Unicode MS"/>
+      <w:rFonts w:asciiTheme="majorHAnsi" w:eastAsiaTheme="majorEastAsia" w:hAnsiTheme="majorHAnsi" w:cstheme="majorBidi" w:ascii="Source Han Sans SC" w:hAnsi="Source Han Sans SC" w:eastAsia="Source Han Sans SC"/>
       <w:i/>
       <w:iCs/>
       <w:color w:val="243F60" w:themeColor="accent1" w:themeShade="7F"/>
@@ -2016,7 +2016,7 @@
       <w:outlineLvl w:val="6"/>
     </w:pPr>
     <w:rPr>
-      <w:rFonts w:asciiTheme="majorHAnsi" w:eastAsiaTheme="majorEastAsia" w:hAnsiTheme="majorHAnsi" w:cstheme="majorBidi" w:ascii="Arial Unicode MS" w:hAnsi="Arial Unicode MS" w:eastAsia="Arial Unicode MS"/>
+      <w:rFonts w:asciiTheme="majorHAnsi" w:eastAsiaTheme="majorEastAsia" w:hAnsiTheme="majorHAnsi" w:cstheme="majorBidi" w:ascii="Source Han Sans SC" w:hAnsi="Source Han Sans SC" w:eastAsia="Source Han Sans SC"/>
       <w:i/>
       <w:iCs/>
       <w:color w:val="404040" w:themeColor="text1" w:themeTint="BF"/>
@@ -2039,7 +2039,7 @@
       <w:outlineLvl w:val="7"/>
     </w:pPr>
     <w:rPr>
-      <w:rFonts w:asciiTheme="majorHAnsi" w:eastAsiaTheme="majorEastAsia" w:hAnsiTheme="majorHAnsi" w:cstheme="majorBidi" w:ascii="Arial Unicode MS" w:hAnsi="Arial Unicode MS" w:eastAsia="Arial Unicode MS"/>
+      <w:rFonts w:asciiTheme="majorHAnsi" w:eastAsiaTheme="majorEastAsia" w:hAnsiTheme="majorHAnsi" w:cstheme="majorBidi" w:ascii="Source Han Sans SC" w:hAnsi="Source Han Sans SC" w:eastAsia="Source Han Sans SC"/>
       <w:color w:val="4F81BD" w:themeColor="accent1"/>
       <w:sz w:val="20"/>
       <w:szCs w:val="20"/>
@@ -2062,7 +2062,7 @@
       <w:outlineLvl w:val="8"/>
     </w:pPr>
     <w:rPr>
-      <w:rFonts w:asciiTheme="majorHAnsi" w:eastAsiaTheme="majorEastAsia" w:hAnsiTheme="majorHAnsi" w:cstheme="majorBidi" w:ascii="Arial Unicode MS" w:hAnsi="Arial Unicode MS" w:eastAsia="Arial Unicode MS"/>
+      <w:rFonts w:asciiTheme="majorHAnsi" w:eastAsiaTheme="majorEastAsia" w:hAnsiTheme="majorHAnsi" w:cstheme="majorBidi" w:ascii="Source Han Sans SC" w:hAnsi="Source Han Sans SC" w:eastAsia="Source Han Sans SC"/>
       <w:i/>
       <w:iCs/>
       <w:color w:val="404040" w:themeColor="text1" w:themeTint="BF"/>
@@ -2076,7 +2076,7 @@
     <w:semiHidden/>
     <w:unhideWhenUsed/>
     <w:rPr>
-      <w:rFonts w:ascii="Arial Unicode MS" w:hAnsi="Arial Unicode MS" w:eastAsia="Arial Unicode MS"/>
+      <w:rFonts w:ascii="Source Han Sans SC" w:hAnsi="Source Han Sans SC" w:eastAsia="Source Han Sans SC"/>
     </w:rPr>
   </w:style>
   <w:style w:type="table" w:default="1" w:styleId="TableNormal">
@@ -2085,7 +2085,7 @@
     <w:semiHidden/>
     <w:unhideWhenUsed/>
     <w:rPr>
-      <w:rFonts w:ascii="Arial Unicode MS" w:hAnsi="Arial Unicode MS" w:eastAsia="Arial Unicode MS"/>
+      <w:rFonts w:ascii="Source Han Sans SC" w:hAnsi="Source Han Sans SC" w:eastAsia="Source Han Sans SC"/>
     </w:rPr>
     <w:tblPr>
       <w:tblInd w:w="0" w:type="dxa"/>
@@ -2112,7 +2112,7 @@
       <w:spacing w:after="0" w:line="240" w:lineRule="auto"/>
     </w:pPr>
     <w:rPr>
-      <w:rFonts w:ascii="Arial Unicode MS" w:hAnsi="Arial Unicode MS" w:eastAsia="Arial Unicode MS"/>
+      <w:rFonts w:ascii="Source Han Sans SC" w:hAnsi="Source Han Sans SC" w:eastAsia="Source Han Sans SC"/>
     </w:rPr>
   </w:style>
   <w:style w:type="character" w:customStyle="1" w:styleId="Heading1Char">
@@ -2122,7 +2122,7 @@
     <w:uiPriority w:val="9"/>
     <w:rsid w:val="00FC693F"/>
     <w:rPr>
-      <w:rFonts w:asciiTheme="majorHAnsi" w:eastAsiaTheme="majorEastAsia" w:hAnsiTheme="majorHAnsi" w:cstheme="majorBidi" w:ascii="Arial Unicode MS" w:hAnsi="Arial Unicode MS" w:eastAsia="Arial Unicode MS"/>
+      <w:rFonts w:asciiTheme="majorHAnsi" w:eastAsiaTheme="majorEastAsia" w:hAnsiTheme="majorHAnsi" w:cstheme="majorBidi" w:ascii="Source Han Sans SC" w:hAnsi="Source Han Sans SC" w:eastAsia="Source Han Sans SC"/>
       <w:b/>
       <w:bCs/>
       <w:color w:val="365F91" w:themeColor="accent1" w:themeShade="BF"/>
@@ -2137,7 +2137,7 @@
     <w:uiPriority w:val="9"/>
     <w:rsid w:val="00FC693F"/>
     <w:rPr>
-      <w:rFonts w:asciiTheme="majorHAnsi" w:eastAsiaTheme="majorEastAsia" w:hAnsiTheme="majorHAnsi" w:cstheme="majorBidi" w:ascii="Arial Unicode MS" w:hAnsi="Arial Unicode MS" w:eastAsia="Arial Unicode MS"/>
+      <w:rFonts w:asciiTheme="majorHAnsi" w:eastAsiaTheme="majorEastAsia" w:hAnsiTheme="majorHAnsi" w:cstheme="majorBidi" w:ascii="Source Han Sans SC" w:hAnsi="Source Han Sans SC" w:eastAsia="Source Han Sans SC"/>
       <w:b/>
       <w:bCs/>
       <w:color w:val="4F81BD" w:themeColor="accent1"/>
@@ -2152,7 +2152,7 @@
     <w:uiPriority w:val="9"/>
     <w:rsid w:val="00FC693F"/>
     <w:rPr>
-      <w:rFonts w:asciiTheme="majorHAnsi" w:eastAsiaTheme="majorEastAsia" w:hAnsiTheme="majorHAnsi" w:cstheme="majorBidi" w:ascii="Arial Unicode MS" w:hAnsi="Arial Unicode MS" w:eastAsia="Arial Unicode MS"/>
+      <w:rFonts w:asciiTheme="majorHAnsi" w:eastAsiaTheme="majorEastAsia" w:hAnsiTheme="majorHAnsi" w:cstheme="majorBidi" w:ascii="Source Han Sans SC" w:hAnsi="Source Han Sans SC" w:eastAsia="Source Han Sans SC"/>
       <w:b/>
       <w:bCs/>
       <w:color w:val="4F81BD" w:themeColor="accent1"/>
@@ -2174,7 +2174,7 @@
       <w:contextualSpacing/>
     </w:pPr>
     <w:rPr>
-      <w:rFonts w:asciiTheme="majorHAnsi" w:eastAsiaTheme="majorEastAsia" w:hAnsiTheme="majorHAnsi" w:cstheme="majorBidi" w:ascii="Arial Unicode MS" w:hAnsi="Arial Unicode MS" w:eastAsia="Arial Unicode MS"/>
+      <w:rFonts w:asciiTheme="majorHAnsi" w:eastAsiaTheme="majorEastAsia" w:hAnsiTheme="majorHAnsi" w:cstheme="majorBidi" w:ascii="Source Han Sans SC" w:hAnsi="Source Han Sans SC" w:eastAsia="Source Han Sans SC"/>
       <w:color w:val="17365D" w:themeColor="text2" w:themeShade="BF"/>
       <w:spacing w:val="5"/>
       <w:kern w:val="28"/>
@@ -2189,7 +2189,7 @@
     <w:uiPriority w:val="10"/>
     <w:rsid w:val="00FC693F"/>
     <w:rPr>
-      <w:rFonts w:asciiTheme="majorHAnsi" w:eastAsiaTheme="majorEastAsia" w:hAnsiTheme="majorHAnsi" w:cstheme="majorBidi" w:ascii="Arial Unicode MS" w:hAnsi="Arial Unicode MS" w:eastAsia="Arial Unicode MS"/>
+      <w:rFonts w:asciiTheme="majorHAnsi" w:eastAsiaTheme="majorEastAsia" w:hAnsiTheme="majorHAnsi" w:cstheme="majorBidi" w:ascii="Source Han Sans SC" w:hAnsi="Source Han Sans SC" w:eastAsia="Source Han Sans SC"/>
       <w:color w:val="17365D" w:themeColor="text2" w:themeShade="BF"/>
       <w:spacing w:val="5"/>
       <w:kern w:val="28"/>
@@ -2211,7 +2211,7 @@
       </w:numPr>
     </w:pPr>
     <w:rPr>
-      <w:rFonts w:asciiTheme="majorHAnsi" w:eastAsiaTheme="majorEastAsia" w:hAnsiTheme="majorHAnsi" w:cstheme="majorBidi" w:ascii="Arial Unicode MS" w:hAnsi="Arial Unicode MS" w:eastAsia="Arial Unicode MS"/>
+      <w:rFonts w:asciiTheme="majorHAnsi" w:eastAsiaTheme="majorEastAsia" w:hAnsiTheme="majorHAnsi" w:cstheme="majorBidi" w:ascii="Source Han Sans SC" w:hAnsi="Source Han Sans SC" w:eastAsia="Source Han Sans SC"/>
       <w:i/>
       <w:iCs/>
       <w:color w:val="4F81BD" w:themeColor="accent1"/>
@@ -2227,7 +2227,7 @@
     <w:uiPriority w:val="11"/>
     <w:rsid w:val="00FC693F"/>
     <w:rPr>
-      <w:rFonts w:asciiTheme="majorHAnsi" w:eastAsiaTheme="majorEastAsia" w:hAnsiTheme="majorHAnsi" w:cstheme="majorBidi" w:ascii="Arial Unicode MS" w:hAnsi="Arial Unicode MS" w:eastAsia="Arial Unicode MS"/>
+      <w:rFonts w:asciiTheme="majorHAnsi" w:eastAsiaTheme="majorEastAsia" w:hAnsiTheme="majorHAnsi" w:cstheme="majorBidi" w:ascii="Source Han Sans SC" w:hAnsi="Source Han Sans SC" w:eastAsia="Source Han Sans SC"/>
       <w:i/>
       <w:iCs/>
       <w:color w:val="4F81BD" w:themeColor="accent1"/>
@@ -2247,7 +2247,7 @@
       <w:contextualSpacing/>
     </w:pPr>
     <w:rPr>
-      <w:rFonts w:ascii="Arial Unicode MS" w:hAnsi="Arial Unicode MS" w:eastAsia="Arial Unicode MS"/>
+      <w:rFonts w:ascii="Source Han Sans SC" w:hAnsi="Source Han Sans SC" w:eastAsia="Source Han Sans SC"/>
     </w:rPr>
   </w:style>
   <w:style w:type="paragraph" w:styleId="BodyText">
@@ -2261,7 +2261,7 @@
       <w:spacing w:after="120"/>
     </w:pPr>
     <w:rPr>
-      <w:rFonts w:ascii="Arial Unicode MS" w:hAnsi="Arial Unicode MS" w:eastAsia="Arial Unicode MS"/>
+      <w:rFonts w:ascii="Source Han Sans SC" w:hAnsi="Source Han Sans SC" w:eastAsia="Source Han Sans SC"/>
     </w:rPr>
   </w:style>
   <w:style w:type="character" w:customStyle="1" w:styleId="BodyTextChar">
@@ -2271,7 +2271,7 @@
     <w:uiPriority w:val="99"/>
     <w:rsid w:val="00AA1D8D"/>
     <w:rPr>
-      <w:rFonts w:ascii="Arial Unicode MS" w:hAnsi="Arial Unicode MS" w:eastAsia="Arial Unicode MS"/>
+      <w:rFonts w:ascii="Source Han Sans SC" w:hAnsi="Source Han Sans SC" w:eastAsia="Source Han Sans SC"/>
     </w:rPr>
   </w:style>
   <w:style w:type="paragraph" w:styleId="BodyText2">
@@ -2285,7 +2285,7 @@
       <w:spacing w:after="120" w:line="480" w:lineRule="auto"/>
     </w:pPr>
     <w:rPr>
-      <w:rFonts w:ascii="Arial Unicode MS" w:hAnsi="Arial Unicode MS" w:eastAsia="Arial Unicode MS"/>
+      <w:rFonts w:ascii="Source Han Sans SC" w:hAnsi="Source Han Sans SC" w:eastAsia="Source Han Sans SC"/>
     </w:rPr>
   </w:style>
   <w:style w:type="character" w:customStyle="1" w:styleId="BodyText2Char">
@@ -2295,7 +2295,7 @@
     <w:uiPriority w:val="99"/>
     <w:rsid w:val="00AA1D8D"/>
     <w:rPr>
-      <w:rFonts w:ascii="Arial Unicode MS" w:hAnsi="Arial Unicode MS" w:eastAsia="Arial Unicode MS"/>
+      <w:rFonts w:ascii="Source Han Sans SC" w:hAnsi="Source Han Sans SC" w:eastAsia="Source Han Sans SC"/>
     </w:rPr>
   </w:style>
   <w:style w:type="paragraph" w:styleId="BodyText3">
@@ -2309,7 +2309,7 @@
       <w:spacing w:after="120"/>
     </w:pPr>
     <w:rPr>
-      <w:rFonts w:ascii="Arial Unicode MS" w:hAnsi="Arial Unicode MS" w:eastAsia="Arial Unicode MS"/>
+      <w:rFonts w:ascii="Source Han Sans SC" w:hAnsi="Source Han Sans SC" w:eastAsia="Source Han Sans SC"/>
       <w:sz w:val="16"/>
       <w:szCs w:val="16"/>
     </w:rPr>
@@ -2321,7 +2321,7 @@
     <w:uiPriority w:val="99"/>
     <w:rsid w:val="00AA1D8D"/>
     <w:rPr>
-      <w:rFonts w:ascii="Arial Unicode MS" w:hAnsi="Arial Unicode MS" w:eastAsia="Arial Unicode MS"/>
+      <w:rFonts w:ascii="Source Han Sans SC" w:hAnsi="Source Han Sans SC" w:eastAsia="Source Han Sans SC"/>
       <w:sz w:val="16"/>
       <w:szCs w:val="16"/>
     </w:rPr>
@@ -2337,7 +2337,7 @@
       <w:contextualSpacing/>
     </w:pPr>
     <w:rPr>
-      <w:rFonts w:ascii="Arial Unicode MS" w:hAnsi="Arial Unicode MS" w:eastAsia="Arial Unicode MS"/>
+      <w:rFonts w:ascii="Source Han Sans SC" w:hAnsi="Source Han Sans SC" w:eastAsia="Source Han Sans SC"/>
     </w:rPr>
   </w:style>
   <w:style w:type="paragraph" w:styleId="List2">
@@ -2351,7 +2351,7 @@
       <w:contextualSpacing/>
     </w:pPr>
     <w:rPr>
-      <w:rFonts w:ascii="Arial Unicode MS" w:hAnsi="Arial Unicode MS" w:eastAsia="Arial Unicode MS"/>
+      <w:rFonts w:ascii="Source Han Sans SC" w:hAnsi="Source Han Sans SC" w:eastAsia="Source Han Sans SC"/>
     </w:rPr>
   </w:style>
   <w:style w:type="paragraph" w:styleId="List3">
@@ -2365,7 +2365,7 @@
       <w:contextualSpacing/>
     </w:pPr>
     <w:rPr>
-      <w:rFonts w:ascii="Arial Unicode MS" w:hAnsi="Arial Unicode MS" w:eastAsia="Arial Unicode MS"/>
+      <w:rFonts w:ascii="Source Han Sans SC" w:hAnsi="Source Han Sans SC" w:eastAsia="Source Han Sans SC"/>
     </w:rPr>
   </w:style>
   <w:style w:type="paragraph" w:styleId="ListBullet">
@@ -2381,7 +2381,7 @@
       <w:contextualSpacing/>
     </w:pPr>
     <w:rPr>
-      <w:rFonts w:ascii="Arial Unicode MS" w:hAnsi="Arial Unicode MS" w:eastAsia="Arial Unicode MS"/>
+      <w:rFonts w:ascii="Source Han Sans SC" w:hAnsi="Source Han Sans SC" w:eastAsia="Source Han Sans SC"/>
       <w:sz w:val="17"/>
     </w:rPr>
   </w:style>
@@ -2398,7 +2398,7 @@
       <w:contextualSpacing/>
     </w:pPr>
     <w:rPr>
-      <w:rFonts w:ascii="Arial Unicode MS" w:hAnsi="Arial Unicode MS" w:eastAsia="Arial Unicode MS"/>
+      <w:rFonts w:ascii="Source Han Sans SC" w:hAnsi="Source Han Sans SC" w:eastAsia="Source Han Sans SC"/>
     </w:rPr>
   </w:style>
   <w:style w:type="paragraph" w:styleId="ListBullet3">
@@ -2414,7 +2414,7 @@
       <w:contextualSpacing/>
     </w:pPr>
     <w:rPr>
-      <w:rFonts w:ascii="Arial Unicode MS" w:hAnsi="Arial Unicode MS" w:eastAsia="Arial Unicode MS"/>
+      <w:rFonts w:ascii="Source Han Sans SC" w:hAnsi="Source Han Sans SC" w:eastAsia="Source Han Sans SC"/>
     </w:rPr>
   </w:style>
   <w:style w:type="paragraph" w:styleId="ListNumber">
@@ -2430,7 +2430,7 @@
       <w:contextualSpacing/>
     </w:pPr>
     <w:rPr>
-      <w:rFonts w:ascii="Arial Unicode MS" w:hAnsi="Arial Unicode MS" w:eastAsia="Arial Unicode MS"/>
+      <w:rFonts w:ascii="Source Han Sans SC" w:hAnsi="Source Han Sans SC" w:eastAsia="Source Han Sans SC"/>
     </w:rPr>
   </w:style>
   <w:style w:type="paragraph" w:styleId="ListNumber2">
@@ -2446,7 +2446,7 @@
       <w:contextualSpacing/>
     </w:pPr>
     <w:rPr>
-      <w:rFonts w:ascii="Arial Unicode MS" w:hAnsi="Arial Unicode MS" w:eastAsia="Arial Unicode MS"/>
+      <w:rFonts w:ascii="Source Han Sans SC" w:hAnsi="Source Han Sans SC" w:eastAsia="Source Han Sans SC"/>
     </w:rPr>
   </w:style>
   <w:style w:type="paragraph" w:styleId="ListNumber3">
@@ -2462,7 +2462,7 @@
       <w:contextualSpacing/>
     </w:pPr>
     <w:rPr>
-      <w:rFonts w:ascii="Arial Unicode MS" w:hAnsi="Arial Unicode MS" w:eastAsia="Arial Unicode MS"/>
+      <w:rFonts w:ascii="Source Han Sans SC" w:hAnsi="Source Han Sans SC" w:eastAsia="Source Han Sans SC"/>
     </w:rPr>
   </w:style>
   <w:style w:type="paragraph" w:styleId="ListContinue">
@@ -2477,7 +2477,7 @@
       <w:contextualSpacing/>
     </w:pPr>
     <w:rPr>
-      <w:rFonts w:ascii="Arial Unicode MS" w:hAnsi="Arial Unicode MS" w:eastAsia="Arial Unicode MS"/>
+      <w:rFonts w:ascii="Source Han Sans SC" w:hAnsi="Source Han Sans SC" w:eastAsia="Source Han Sans SC"/>
     </w:rPr>
   </w:style>
   <w:style w:type="paragraph" w:styleId="ListContinue2">
@@ -2492,7 +2492,7 @@
       <w:contextualSpacing/>
     </w:pPr>
     <w:rPr>
-      <w:rFonts w:ascii="Arial Unicode MS" w:hAnsi="Arial Unicode MS" w:eastAsia="Arial Unicode MS"/>
+      <w:rFonts w:ascii="Source Han Sans SC" w:hAnsi="Source Han Sans SC" w:eastAsia="Source Han Sans SC"/>
     </w:rPr>
   </w:style>
   <w:style w:type="paragraph" w:styleId="ListContinue3">
@@ -2507,7 +2507,7 @@
       <w:contextualSpacing/>
     </w:pPr>
     <w:rPr>
-      <w:rFonts w:ascii="Arial Unicode MS" w:hAnsi="Arial Unicode MS" w:eastAsia="Arial Unicode MS"/>
+      <w:rFonts w:ascii="Source Han Sans SC" w:hAnsi="Source Han Sans SC" w:eastAsia="Source Han Sans SC"/>
     </w:rPr>
   </w:style>
   <w:style w:type="paragraph" w:styleId="MacroText">
@@ -2528,7 +2528,7 @@
       </w:tabs>
     </w:pPr>
     <w:rPr>
-      <w:rFonts w:ascii="Arial Unicode MS" w:hAnsi="Arial Unicode MS" w:eastAsia="Arial Unicode MS"/>
+      <w:rFonts w:ascii="Source Han Sans SC" w:hAnsi="Source Han Sans SC" w:eastAsia="Source Han Sans SC"/>
       <w:sz w:val="20"/>
       <w:szCs w:val="20"/>
     </w:rPr>
@@ -2540,7 +2540,7 @@
     <w:uiPriority w:val="99"/>
     <w:rsid w:val="0029639D"/>
     <w:rPr>
-      <w:rFonts w:ascii="Arial Unicode MS" w:hAnsi="Arial Unicode MS" w:eastAsia="Arial Unicode MS"/>
+      <w:rFonts w:ascii="Source Han Sans SC" w:hAnsi="Source Han Sans SC" w:eastAsia="Source Han Sans SC"/>
       <w:sz w:val="20"/>
       <w:szCs w:val="20"/>
     </w:rPr>
@@ -2554,7 +2554,7 @@
     <w:qFormat/>
     <w:rsid w:val="00FC693F"/>
     <w:rPr>
-      <w:rFonts w:ascii="Arial Unicode MS" w:hAnsi="Arial Unicode MS" w:eastAsia="Arial Unicode MS"/>
+      <w:rFonts w:ascii="Source Han Sans SC" w:hAnsi="Source Han Sans SC" w:eastAsia="Source Han Sans SC"/>
       <w:i/>
       <w:iCs/>
       <w:color w:val="000000" w:themeColor="text1"/>
@@ -2567,7 +2567,7 @@
     <w:uiPriority w:val="29"/>
     <w:rsid w:val="00FC693F"/>
     <w:rPr>
-      <w:rFonts w:ascii="Arial Unicode MS" w:hAnsi="Arial Unicode MS" w:eastAsia="Arial Unicode MS"/>
+      <w:rFonts w:ascii="Source Han Sans SC" w:hAnsi="Source Han Sans SC" w:eastAsia="Source Han Sans SC"/>
       <w:i/>
       <w:iCs/>
       <w:color w:val="000000" w:themeColor="text1"/>
@@ -2581,7 +2581,7 @@
     <w:semiHidden/>
     <w:rsid w:val="00FC693F"/>
     <w:rPr>
-      <w:rFonts w:asciiTheme="majorHAnsi" w:eastAsiaTheme="majorEastAsia" w:hAnsiTheme="majorHAnsi" w:cstheme="majorBidi" w:ascii="Arial Unicode MS" w:hAnsi="Arial Unicode MS" w:eastAsia="Arial Unicode MS"/>
+      <w:rFonts w:asciiTheme="majorHAnsi" w:eastAsiaTheme="majorEastAsia" w:hAnsiTheme="majorHAnsi" w:cstheme="majorBidi" w:ascii="Source Han Sans SC" w:hAnsi="Source Han Sans SC" w:eastAsia="Source Han Sans SC"/>
       <w:b/>
       <w:bCs/>
       <w:i/>
@@ -2597,7 +2597,7 @@
     <w:semiHidden/>
     <w:rsid w:val="00FC693F"/>
     <w:rPr>
-      <w:rFonts w:asciiTheme="majorHAnsi" w:eastAsiaTheme="majorEastAsia" w:hAnsiTheme="majorHAnsi" w:cstheme="majorBidi" w:ascii="Arial Unicode MS" w:hAnsi="Arial Unicode MS" w:eastAsia="Arial Unicode MS"/>
+      <w:rFonts w:asciiTheme="majorHAnsi" w:eastAsiaTheme="majorEastAsia" w:hAnsiTheme="majorHAnsi" w:cstheme="majorBidi" w:ascii="Source Han Sans SC" w:hAnsi="Source Han Sans SC" w:eastAsia="Source Han Sans SC"/>
       <w:color w:val="243F60" w:themeColor="accent1" w:themeShade="7F"/>
     </w:rPr>
   </w:style>
@@ -2609,7 +2609,7 @@
     <w:semiHidden/>
     <w:rsid w:val="00FC693F"/>
     <w:rPr>
-      <w:rFonts w:asciiTheme="majorHAnsi" w:eastAsiaTheme="majorEastAsia" w:hAnsiTheme="majorHAnsi" w:cstheme="majorBidi" w:ascii="Arial Unicode MS" w:hAnsi="Arial Unicode MS" w:eastAsia="Arial Unicode MS"/>
+      <w:rFonts w:asciiTheme="majorHAnsi" w:eastAsiaTheme="majorEastAsia" w:hAnsiTheme="majorHAnsi" w:cstheme="majorBidi" w:ascii="Source Han Sans SC" w:hAnsi="Source Han Sans SC" w:eastAsia="Source Han Sans SC"/>
       <w:i/>
       <w:iCs/>
       <w:color w:val="243F60" w:themeColor="accent1" w:themeShade="7F"/>
@@ -2623,7 +2623,7 @@
     <w:semiHidden/>
     <w:rsid w:val="00FC693F"/>
     <w:rPr>
-      <w:rFonts w:asciiTheme="majorHAnsi" w:eastAsiaTheme="majorEastAsia" w:hAnsiTheme="majorHAnsi" w:cstheme="majorBidi" w:ascii="Arial Unicode MS" w:hAnsi="Arial Unicode MS" w:eastAsia="Arial Unicode MS"/>
+      <w:rFonts w:asciiTheme="majorHAnsi" w:eastAsiaTheme="majorEastAsia" w:hAnsiTheme="majorHAnsi" w:cstheme="majorBidi" w:ascii="Source Han Sans SC" w:hAnsi="Source Han Sans SC" w:eastAsia="Source Han Sans SC"/>
       <w:i/>
       <w:iCs/>
       <w:color w:val="404040" w:themeColor="text1" w:themeTint="BF"/>
@@ -2637,7 +2637,7 @@
     <w:semiHidden/>
     <w:rsid w:val="00FC693F"/>
     <w:rPr>
-      <w:rFonts w:asciiTheme="majorHAnsi" w:eastAsiaTheme="majorEastAsia" w:hAnsiTheme="majorHAnsi" w:cstheme="majorBidi" w:ascii="Arial Unicode MS" w:hAnsi="Arial Unicode MS" w:eastAsia="Arial Unicode MS"/>
+      <w:rFonts w:asciiTheme="majorHAnsi" w:eastAsiaTheme="majorEastAsia" w:hAnsiTheme="majorHAnsi" w:cstheme="majorBidi" w:ascii="Source Han Sans SC" w:hAnsi="Source Han Sans SC" w:eastAsia="Source Han Sans SC"/>
       <w:color w:val="4F81BD" w:themeColor="accent1"/>
       <w:sz w:val="20"/>
       <w:szCs w:val="20"/>
@@ -2651,7 +2651,7 @@
     <w:semiHidden/>
     <w:rsid w:val="00FC693F"/>
     <w:rPr>
-      <w:rFonts w:asciiTheme="majorHAnsi" w:eastAsiaTheme="majorEastAsia" w:hAnsiTheme="majorHAnsi" w:cstheme="majorBidi" w:ascii="Arial Unicode MS" w:hAnsi="Arial Unicode MS" w:eastAsia="Arial Unicode MS"/>
+      <w:rFonts w:asciiTheme="majorHAnsi" w:eastAsiaTheme="majorEastAsia" w:hAnsiTheme="majorHAnsi" w:cstheme="majorBidi" w:ascii="Source Han Sans SC" w:hAnsi="Source Han Sans SC" w:eastAsia="Source Han Sans SC"/>
       <w:i/>
       <w:iCs/>
       <w:color w:val="404040" w:themeColor="text1" w:themeTint="BF"/>
@@ -2672,7 +2672,7 @@
       <w:spacing w:line="240" w:lineRule="auto"/>
     </w:pPr>
     <w:rPr>
-      <w:rFonts w:ascii="Arial Unicode MS" w:hAnsi="Arial Unicode MS" w:eastAsia="Arial Unicode MS"/>
+      <w:rFonts w:ascii="Source Han Sans SC" w:hAnsi="Source Han Sans SC" w:eastAsia="Source Han Sans SC"/>
       <w:b/>
       <w:bCs/>
       <w:color w:val="4F81BD" w:themeColor="accent1"/>
@@ -2687,7 +2687,7 @@
     <w:qFormat/>
     <w:rsid w:val="00FC693F"/>
     <w:rPr>
-      <w:rFonts w:ascii="Arial Unicode MS" w:hAnsi="Arial Unicode MS" w:eastAsia="Arial Unicode MS"/>
+      <w:rFonts w:ascii="Source Han Sans SC" w:hAnsi="Source Han Sans SC" w:eastAsia="Source Han Sans SC"/>
       <w:b/>
       <w:bCs/>
     </w:rPr>
@@ -2699,7 +2699,7 @@
     <w:qFormat/>
     <w:rsid w:val="00FC693F"/>
     <w:rPr>
-      <w:rFonts w:ascii="Arial Unicode MS" w:hAnsi="Arial Unicode MS" w:eastAsia="Arial Unicode MS"/>
+      <w:rFonts w:ascii="Source Han Sans SC" w:hAnsi="Source Han Sans SC" w:eastAsia="Source Han Sans SC"/>
       <w:i/>
       <w:iCs/>
     </w:rPr>
@@ -2720,7 +2720,7 @@
       <w:ind w:left="936" w:right="936"/>
     </w:pPr>
     <w:rPr>
-      <w:rFonts w:ascii="Arial Unicode MS" w:hAnsi="Arial Unicode MS" w:eastAsia="Arial Unicode MS"/>
+      <w:rFonts w:ascii="Source Han Sans SC" w:hAnsi="Source Han Sans SC" w:eastAsia="Source Han Sans SC"/>
       <w:b/>
       <w:bCs/>
       <w:i/>
@@ -2735,7 +2735,7 @@
     <w:uiPriority w:val="30"/>
     <w:rsid w:val="00FC693F"/>
     <w:rPr>
-      <w:rFonts w:ascii="Arial Unicode MS" w:hAnsi="Arial Unicode MS" w:eastAsia="Arial Unicode MS"/>
+      <w:rFonts w:ascii="Source Han Sans SC" w:hAnsi="Source Han Sans SC" w:eastAsia="Source Han Sans SC"/>
       <w:b/>
       <w:bCs/>
       <w:i/>
@@ -2750,7 +2750,7 @@
     <w:qFormat/>
     <w:rsid w:val="00FC693F"/>
     <w:rPr>
-      <w:rFonts w:ascii="Arial Unicode MS" w:hAnsi="Arial Unicode MS" w:eastAsia="Arial Unicode MS"/>
+      <w:rFonts w:ascii="Source Han Sans SC" w:hAnsi="Source Han Sans SC" w:eastAsia="Source Han Sans SC"/>
       <w:i/>
       <w:iCs/>
       <w:color w:val="808080" w:themeColor="text1" w:themeTint="7F"/>
@@ -2763,7 +2763,7 @@
     <w:qFormat/>
     <w:rsid w:val="00FC693F"/>
     <w:rPr>
-      <w:rFonts w:ascii="Arial Unicode MS" w:hAnsi="Arial Unicode MS" w:eastAsia="Arial Unicode MS"/>
+      <w:rFonts w:ascii="Source Han Sans SC" w:hAnsi="Source Han Sans SC" w:eastAsia="Source Han Sans SC"/>
       <w:b/>
       <w:bCs/>
       <w:i/>
@@ -2778,7 +2778,7 @@
     <w:qFormat/>
     <w:rsid w:val="00FC693F"/>
     <w:rPr>
-      <w:rFonts w:ascii="Arial Unicode MS" w:hAnsi="Arial Unicode MS" w:eastAsia="Arial Unicode MS"/>
+      <w:rFonts w:ascii="Source Han Sans SC" w:hAnsi="Source Han Sans SC" w:eastAsia="Source Han Sans SC"/>
       <w:smallCaps/>
       <w:color w:val="C0504D" w:themeColor="accent2"/>
       <w:u w:val="single"/>
@@ -2791,7 +2791,7 @@
     <w:qFormat/>
     <w:rsid w:val="00FC693F"/>
     <w:rPr>
-      <w:rFonts w:ascii="Arial Unicode MS" w:hAnsi="Arial Unicode MS" w:eastAsia="Arial Unicode MS"/>
+      <w:rFonts w:ascii="Source Han Sans SC" w:hAnsi="Source Han Sans SC" w:eastAsia="Source Han Sans SC"/>
       <w:b/>
       <w:bCs/>
       <w:smallCaps/>
@@ -2807,7 +2807,7 @@
     <w:qFormat/>
     <w:rsid w:val="00FC693F"/>
     <w:rPr>
-      <w:rFonts w:ascii="Arial Unicode MS" w:hAnsi="Arial Unicode MS" w:eastAsia="Arial Unicode MS"/>
+      <w:rFonts w:ascii="Source Han Sans SC" w:hAnsi="Source Han Sans SC" w:eastAsia="Source Han Sans SC"/>
       <w:b/>
       <w:bCs/>
       <w:smallCaps/>
@@ -2827,7 +2827,7 @@
       <w:outlineLvl w:val="9"/>
     </w:pPr>
     <w:rPr>
-      <w:rFonts w:ascii="Arial Unicode MS" w:hAnsi="Arial Unicode MS" w:eastAsia="Arial Unicode MS"/>
+      <w:rFonts w:ascii="Source Han Sans SC" w:hAnsi="Source Han Sans SC" w:eastAsia="Source Han Sans SC"/>
     </w:rPr>
   </w:style>
   <w:style w:type="table" w:styleId="TableGrid">
@@ -2839,7 +2839,7 @@
       <w:spacing w:after="0" w:line="240" w:lineRule="auto"/>
     </w:pPr>
     <w:rPr>
-      <w:rFonts w:ascii="Arial Unicode MS" w:hAnsi="Arial Unicode MS" w:eastAsia="Arial Unicode MS"/>
+      <w:rFonts w:ascii="Source Han Sans SC" w:hAnsi="Source Han Sans SC" w:eastAsia="Source Han Sans SC"/>
     </w:rPr>
     <w:tblPr>
       <w:tblInd w:w="0" w:type="dxa"/>
@@ -2868,7 +2868,7 @@
       <w:spacing w:after="0" w:line="240" w:lineRule="auto"/>
     </w:pPr>
     <w:rPr>
-      <w:rFonts w:ascii="Arial Unicode MS" w:hAnsi="Arial Unicode MS" w:eastAsia="Arial Unicode MS"/>
+      <w:rFonts w:ascii="Source Han Sans SC" w:hAnsi="Source Han Sans SC" w:eastAsia="Source Han Sans SC"/>
       <w:color w:val="000000" w:themeColor="text1" w:themeShade="BF"/>
     </w:rPr>
     <w:tblPr>
@@ -2972,7 +2972,7 @@
       <w:spacing w:after="0" w:line="240" w:lineRule="auto"/>
     </w:pPr>
     <w:rPr>
-      <w:rFonts w:ascii="Arial Unicode MS" w:hAnsi="Arial Unicode MS" w:eastAsia="Arial Unicode MS"/>
+      <w:rFonts w:ascii="Source Han Sans SC" w:hAnsi="Source Han Sans SC" w:eastAsia="Source Han Sans SC"/>
       <w:color w:val="365F91" w:themeColor="accent1" w:themeShade="BF"/>
     </w:rPr>
     <w:tblPr>
@@ -3076,7 +3076,7 @@
       <w:spacing w:after="0" w:line="240" w:lineRule="auto"/>
     </w:pPr>
     <w:rPr>
-      <w:rFonts w:ascii="Arial Unicode MS" w:hAnsi="Arial Unicode MS" w:eastAsia="Arial Unicode MS"/>
+      <w:rFonts w:ascii="Source Han Sans SC" w:hAnsi="Source Han Sans SC" w:eastAsia="Source Han Sans SC"/>
       <w:color w:val="943634" w:themeColor="accent2" w:themeShade="BF"/>
     </w:rPr>
     <w:tblPr>
@@ -3180,7 +3180,7 @@
       <w:spacing w:after="0" w:line="240" w:lineRule="auto"/>
     </w:pPr>
     <w:rPr>
-      <w:rFonts w:ascii="Arial Unicode MS" w:hAnsi="Arial Unicode MS" w:eastAsia="Arial Unicode MS"/>
+      <w:rFonts w:ascii="Source Han Sans SC" w:hAnsi="Source Han Sans SC" w:eastAsia="Source Han Sans SC"/>
       <w:color w:val="76923C" w:themeColor="accent3" w:themeShade="BF"/>
     </w:rPr>
     <w:tblPr>
@@ -3284,7 +3284,7 @@
       <w:spacing w:after="0" w:line="240" w:lineRule="auto"/>
     </w:pPr>
     <w:rPr>
-      <w:rFonts w:ascii="Arial Unicode MS" w:hAnsi="Arial Unicode MS" w:eastAsia="Arial Unicode MS"/>
+      <w:rFonts w:ascii="Source Han Sans SC" w:hAnsi="Source Han Sans SC" w:eastAsia="Source Han Sans SC"/>
       <w:color w:val="5F497A" w:themeColor="accent4" w:themeShade="BF"/>
     </w:rPr>
     <w:tblPr>
@@ -3388,7 +3388,7 @@
       <w:spacing w:after="0" w:line="240" w:lineRule="auto"/>
     </w:pPr>
     <w:rPr>
-      <w:rFonts w:ascii="Arial Unicode MS" w:hAnsi="Arial Unicode MS" w:eastAsia="Arial Unicode MS"/>
+      <w:rFonts w:ascii="Source Han Sans SC" w:hAnsi="Source Han Sans SC" w:eastAsia="Source Han Sans SC"/>
       <w:color w:val="31849B" w:themeColor="accent5" w:themeShade="BF"/>
     </w:rPr>
     <w:tblPr>
@@ -3492,7 +3492,7 @@
       <w:spacing w:after="0" w:line="240" w:lineRule="auto"/>
     </w:pPr>
     <w:rPr>
-      <w:rFonts w:ascii="Arial Unicode MS" w:hAnsi="Arial Unicode MS" w:eastAsia="Arial Unicode MS"/>
+      <w:rFonts w:ascii="Source Han Sans SC" w:hAnsi="Source Han Sans SC" w:eastAsia="Source Han Sans SC"/>
       <w:color w:val="E36C0A" w:themeColor="accent6" w:themeShade="BF"/>
     </w:rPr>
     <w:tblPr>
@@ -3596,7 +3596,7 @@
       <w:spacing w:after="0" w:line="240" w:lineRule="auto"/>
     </w:pPr>
     <w:rPr>
-      <w:rFonts w:ascii="Arial Unicode MS" w:hAnsi="Arial Unicode MS" w:eastAsia="Arial Unicode MS"/>
+      <w:rFonts w:ascii="Source Han Sans SC" w:hAnsi="Source Han Sans SC" w:eastAsia="Source Han Sans SC"/>
     </w:rPr>
     <w:tblPr>
       <w:tblStyleRowBandSize w:val="1"/>
@@ -3691,7 +3691,7 @@
       <w:spacing w:after="0" w:line="240" w:lineRule="auto"/>
     </w:pPr>
     <w:rPr>
-      <w:rFonts w:ascii="Arial Unicode MS" w:hAnsi="Arial Unicode MS" w:eastAsia="Arial Unicode MS"/>
+      <w:rFonts w:ascii="Source Han Sans SC" w:hAnsi="Source Han Sans SC" w:eastAsia="Source Han Sans SC"/>
     </w:rPr>
     <w:tblPr>
       <w:tblStyleRowBandSize w:val="1"/>
@@ -3786,7 +3786,7 @@
       <w:spacing w:after="0" w:line="240" w:lineRule="auto"/>
     </w:pPr>
     <w:rPr>
-      <w:rFonts w:ascii="Arial Unicode MS" w:hAnsi="Arial Unicode MS" w:eastAsia="Arial Unicode MS"/>
+      <w:rFonts w:ascii="Source Han Sans SC" w:hAnsi="Source Han Sans SC" w:eastAsia="Source Han Sans SC"/>
     </w:rPr>
     <w:tblPr>
       <w:tblStyleRowBandSize w:val="1"/>
@@ -3881,7 +3881,7 @@
       <w:spacing w:after="0" w:line="240" w:lineRule="auto"/>
     </w:pPr>
     <w:rPr>
-      <w:rFonts w:ascii="Arial Unicode MS" w:hAnsi="Arial Unicode MS" w:eastAsia="Arial Unicode MS"/>
+      <w:rFonts w:ascii="Source Han Sans SC" w:hAnsi="Source Han Sans SC" w:eastAsia="Source Han Sans SC"/>
     </w:rPr>
     <w:tblPr>
       <w:tblStyleRowBandSize w:val="1"/>
@@ -3976,7 +3976,7 @@
       <w:spacing w:after="0" w:line="240" w:lineRule="auto"/>
     </w:pPr>
     <w:rPr>
-      <w:rFonts w:ascii="Arial Unicode MS" w:hAnsi="Arial Unicode MS" w:eastAsia="Arial Unicode MS"/>
+      <w:rFonts w:ascii="Source Han Sans SC" w:hAnsi="Source Han Sans SC" w:eastAsia="Source Han Sans SC"/>
     </w:rPr>
     <w:tblPr>
       <w:tblStyleRowBandSize w:val="1"/>
@@ -4071,7 +4071,7 @@
       <w:spacing w:after="0" w:line="240" w:lineRule="auto"/>
     </w:pPr>
     <w:rPr>
-      <w:rFonts w:ascii="Arial Unicode MS" w:hAnsi="Arial Unicode MS" w:eastAsia="Arial Unicode MS"/>
+      <w:rFonts w:ascii="Source Han Sans SC" w:hAnsi="Source Han Sans SC" w:eastAsia="Source Han Sans SC"/>
     </w:rPr>
     <w:tblPr>
       <w:tblStyleRowBandSize w:val="1"/>
@@ -4166,7 +4166,7 @@
       <w:spacing w:after="0" w:line="240" w:lineRule="auto"/>
     </w:pPr>
     <w:rPr>
-      <w:rFonts w:ascii="Arial Unicode MS" w:hAnsi="Arial Unicode MS" w:eastAsia="Arial Unicode MS"/>
+      <w:rFonts w:ascii="Source Han Sans SC" w:hAnsi="Source Han Sans SC" w:eastAsia="Source Han Sans SC"/>
     </w:rPr>
     <w:tblPr>
       <w:tblStyleRowBandSize w:val="1"/>
@@ -4261,7 +4261,7 @@
       <w:spacing w:after="0" w:line="240" w:lineRule="auto"/>
     </w:pPr>
     <w:rPr>
-      <w:rFonts w:ascii="Arial Unicode MS" w:hAnsi="Arial Unicode MS" w:eastAsia="Arial Unicode MS"/>
+      <w:rFonts w:ascii="Source Han Sans SC" w:hAnsi="Source Han Sans SC" w:eastAsia="Source Han Sans SC"/>
     </w:rPr>
     <w:tblPr>
       <w:tblStyleRowBandSize w:val="1"/>
@@ -4394,7 +4394,7 @@
       <w:spacing w:after="0" w:line="240" w:lineRule="auto"/>
     </w:pPr>
     <w:rPr>
-      <w:rFonts w:ascii="Arial Unicode MS" w:hAnsi="Arial Unicode MS" w:eastAsia="Arial Unicode MS"/>
+      <w:rFonts w:ascii="Source Han Sans SC" w:hAnsi="Source Han Sans SC" w:eastAsia="Source Han Sans SC"/>
     </w:rPr>
     <w:tblPr>
       <w:tblStyleRowBandSize w:val="1"/>
@@ -4527,7 +4527,7 @@
       <w:spacing w:after="0" w:line="240" w:lineRule="auto"/>
     </w:pPr>
     <w:rPr>
-      <w:rFonts w:ascii="Arial Unicode MS" w:hAnsi="Arial Unicode MS" w:eastAsia="Arial Unicode MS"/>
+      <w:rFonts w:ascii="Source Han Sans SC" w:hAnsi="Source Han Sans SC" w:eastAsia="Source Han Sans SC"/>
     </w:rPr>
     <w:tblPr>
       <w:tblStyleRowBandSize w:val="1"/>
@@ -4660,7 +4660,7 @@
       <w:spacing w:after="0" w:line="240" w:lineRule="auto"/>
     </w:pPr>
     <w:rPr>
-      <w:rFonts w:ascii="Arial Unicode MS" w:hAnsi="Arial Unicode MS" w:eastAsia="Arial Unicode MS"/>
+      <w:rFonts w:ascii="Source Han Sans SC" w:hAnsi="Source Han Sans SC" w:eastAsia="Source Han Sans SC"/>
     </w:rPr>
     <w:tblPr>
       <w:tblStyleRowBandSize w:val="1"/>
@@ -4793,7 +4793,7 @@
       <w:spacing w:after="0" w:line="240" w:lineRule="auto"/>
     </w:pPr>
     <w:rPr>
-      <w:rFonts w:ascii="Arial Unicode MS" w:hAnsi="Arial Unicode MS" w:eastAsia="Arial Unicode MS"/>
+      <w:rFonts w:ascii="Source Han Sans SC" w:hAnsi="Source Han Sans SC" w:eastAsia="Source Han Sans SC"/>
     </w:rPr>
     <w:tblPr>
       <w:tblStyleRowBandSize w:val="1"/>
@@ -4926,7 +4926,7 @@
       <w:spacing w:after="0" w:line="240" w:lineRule="auto"/>
     </w:pPr>
     <w:rPr>
-      <w:rFonts w:ascii="Arial Unicode MS" w:hAnsi="Arial Unicode MS" w:eastAsia="Arial Unicode MS"/>
+      <w:rFonts w:ascii="Source Han Sans SC" w:hAnsi="Source Han Sans SC" w:eastAsia="Source Han Sans SC"/>
     </w:rPr>
     <w:tblPr>
       <w:tblStyleRowBandSize w:val="1"/>
@@ -5059,7 +5059,7 @@
       <w:spacing w:after="0" w:line="240" w:lineRule="auto"/>
     </w:pPr>
     <w:rPr>
-      <w:rFonts w:ascii="Arial Unicode MS" w:hAnsi="Arial Unicode MS" w:eastAsia="Arial Unicode MS"/>
+      <w:rFonts w:ascii="Source Han Sans SC" w:hAnsi="Source Han Sans SC" w:eastAsia="Source Han Sans SC"/>
     </w:rPr>
     <w:tblPr>
       <w:tblStyleRowBandSize w:val="1"/>
@@ -5192,7 +5192,7 @@
       <w:spacing w:after="0" w:line="240" w:lineRule="auto"/>
     </w:pPr>
     <w:rPr>
-      <w:rFonts w:ascii="Arial Unicode MS" w:hAnsi="Arial Unicode MS" w:eastAsia="Arial Unicode MS"/>
+      <w:rFonts w:ascii="Source Han Sans SC" w:hAnsi="Source Han Sans SC" w:eastAsia="Source Han Sans SC"/>
     </w:rPr>
     <w:tblPr>
       <w:tblStyleRowBandSize w:val="1"/>
@@ -5301,7 +5301,7 @@
       <w:spacing w:after="0" w:line="240" w:lineRule="auto"/>
     </w:pPr>
     <w:rPr>
-      <w:rFonts w:ascii="Arial Unicode MS" w:hAnsi="Arial Unicode MS" w:eastAsia="Arial Unicode MS"/>
+      <w:rFonts w:ascii="Source Han Sans SC" w:hAnsi="Source Han Sans SC" w:eastAsia="Source Han Sans SC"/>
     </w:rPr>
     <w:tblPr>
       <w:tblStyleRowBandSize w:val="1"/>
@@ -5410,7 +5410,7 @@
       <w:spacing w:after="0" w:line="240" w:lineRule="auto"/>
     </w:pPr>
     <w:rPr>
-      <w:rFonts w:ascii="Arial Unicode MS" w:hAnsi="Arial Unicode MS" w:eastAsia="Arial Unicode MS"/>
+      <w:rFonts w:ascii="Source Han Sans SC" w:hAnsi="Source Han Sans SC" w:eastAsia="Source Han Sans SC"/>
     </w:rPr>
     <w:tblPr>
       <w:tblStyleRowBandSize w:val="1"/>
@@ -5519,7 +5519,7 @@
       <w:spacing w:after="0" w:line="240" w:lineRule="auto"/>
     </w:pPr>
     <w:rPr>
-      <w:rFonts w:ascii="Arial Unicode MS" w:hAnsi="Arial Unicode MS" w:eastAsia="Arial Unicode MS"/>
+      <w:rFonts w:ascii="Source Han Sans SC" w:hAnsi="Source Han Sans SC" w:eastAsia="Source Han Sans SC"/>
     </w:rPr>
     <w:tblPr>
       <w:tblStyleRowBandSize w:val="1"/>
@@ -5628,7 +5628,7 @@
       <w:spacing w:after="0" w:line="240" w:lineRule="auto"/>
     </w:pPr>
     <w:rPr>
-      <w:rFonts w:ascii="Arial Unicode MS" w:hAnsi="Arial Unicode MS" w:eastAsia="Arial Unicode MS"/>
+      <w:rFonts w:ascii="Source Han Sans SC" w:hAnsi="Source Han Sans SC" w:eastAsia="Source Han Sans SC"/>
     </w:rPr>
     <w:tblPr>
       <w:tblStyleRowBandSize w:val="1"/>
@@ -5737,7 +5737,7 @@
       <w:spacing w:after="0" w:line="240" w:lineRule="auto"/>
     </w:pPr>
     <w:rPr>
-      <w:rFonts w:ascii="Arial Unicode MS" w:hAnsi="Arial Unicode MS" w:eastAsia="Arial Unicode MS"/>
+      <w:rFonts w:ascii="Source Han Sans SC" w:hAnsi="Source Han Sans SC" w:eastAsia="Source Han Sans SC"/>
     </w:rPr>
     <w:tblPr>
       <w:tblStyleRowBandSize w:val="1"/>
@@ -5846,7 +5846,7 @@
       <w:spacing w:after="0" w:line="240" w:lineRule="auto"/>
     </w:pPr>
     <w:rPr>
-      <w:rFonts w:ascii="Arial Unicode MS" w:hAnsi="Arial Unicode MS" w:eastAsia="Arial Unicode MS"/>
+      <w:rFonts w:ascii="Source Han Sans SC" w:hAnsi="Source Han Sans SC" w:eastAsia="Source Han Sans SC"/>
     </w:rPr>
     <w:tblPr>
       <w:tblStyleRowBandSize w:val="1"/>
@@ -5955,7 +5955,7 @@
       <w:spacing w:after="0" w:line="240" w:lineRule="auto"/>
     </w:pPr>
     <w:rPr>
-      <w:rFonts w:ascii="Arial Unicode MS" w:hAnsi="Arial Unicode MS" w:eastAsia="Arial Unicode MS"/>
+      <w:rFonts w:ascii="Source Han Sans SC" w:hAnsi="Source Han Sans SC" w:eastAsia="Source Han Sans SC"/>
     </w:rPr>
     <w:tblPr>
       <w:tblStyleRowBandSize w:val="1"/>
@@ -6107,7 +6107,7 @@
       <w:spacing w:after="0" w:line="240" w:lineRule="auto"/>
     </w:pPr>
     <w:rPr>
-      <w:rFonts w:ascii="Arial Unicode MS" w:hAnsi="Arial Unicode MS" w:eastAsia="Arial Unicode MS"/>
+      <w:rFonts w:ascii="Source Han Sans SC" w:hAnsi="Source Han Sans SC" w:eastAsia="Source Han Sans SC"/>
     </w:rPr>
     <w:tblPr>
       <w:tblStyleRowBandSize w:val="1"/>
@@ -6259,7 +6259,7 @@
       <w:spacing w:after="0" w:line="240" w:lineRule="auto"/>
     </w:pPr>
     <w:rPr>
-      <w:rFonts w:ascii="Arial Unicode MS" w:hAnsi="Arial Unicode MS" w:eastAsia="Arial Unicode MS"/>
+      <w:rFonts w:ascii="Source Han Sans SC" w:hAnsi="Source Han Sans SC" w:eastAsia="Source Han Sans SC"/>
     </w:rPr>
     <w:tblPr>
       <w:tblStyleRowBandSize w:val="1"/>
@@ -6411,7 +6411,7 @@
       <w:spacing w:after="0" w:line="240" w:lineRule="auto"/>
     </w:pPr>
     <w:rPr>
-      <w:rFonts w:ascii="Arial Unicode MS" w:hAnsi="Arial Unicode MS" w:eastAsia="Arial Unicode MS"/>
+      <w:rFonts w:ascii="Source Han Sans SC" w:hAnsi="Source Han Sans SC" w:eastAsia="Source Han Sans SC"/>
     </w:rPr>
     <w:tblPr>
       <w:tblStyleRowBandSize w:val="1"/>
@@ -6563,7 +6563,7 @@
       <w:spacing w:after="0" w:line="240" w:lineRule="auto"/>
     </w:pPr>
     <w:rPr>
-      <w:rFonts w:ascii="Arial Unicode MS" w:hAnsi="Arial Unicode MS" w:eastAsia="Arial Unicode MS"/>
+      <w:rFonts w:ascii="Source Han Sans SC" w:hAnsi="Source Han Sans SC" w:eastAsia="Source Han Sans SC"/>
     </w:rPr>
     <w:tblPr>
       <w:tblStyleRowBandSize w:val="1"/>
@@ -6715,7 +6715,7 @@
       <w:spacing w:after="0" w:line="240" w:lineRule="auto"/>
     </w:pPr>
     <w:rPr>
-      <w:rFonts w:ascii="Arial Unicode MS" w:hAnsi="Arial Unicode MS" w:eastAsia="Arial Unicode MS"/>
+      <w:rFonts w:ascii="Source Han Sans SC" w:hAnsi="Source Han Sans SC" w:eastAsia="Source Han Sans SC"/>
     </w:rPr>
     <w:tblPr>
       <w:tblStyleRowBandSize w:val="1"/>
@@ -6867,7 +6867,7 @@
       <w:spacing w:after="0" w:line="240" w:lineRule="auto"/>
     </w:pPr>
     <w:rPr>
-      <w:rFonts w:ascii="Arial Unicode MS" w:hAnsi="Arial Unicode MS" w:eastAsia="Arial Unicode MS"/>
+      <w:rFonts w:ascii="Source Han Sans SC" w:hAnsi="Source Han Sans SC" w:eastAsia="Source Han Sans SC"/>
     </w:rPr>
     <w:tblPr>
       <w:tblStyleRowBandSize w:val="1"/>
@@ -7019,7 +7019,7 @@
       <w:spacing w:after="0" w:line="240" w:lineRule="auto"/>
     </w:pPr>
     <w:rPr>
-      <w:rFonts w:ascii="Arial Unicode MS" w:hAnsi="Arial Unicode MS" w:eastAsia="Arial Unicode MS"/>
+      <w:rFonts w:ascii="Source Han Sans SC" w:hAnsi="Source Han Sans SC" w:eastAsia="Source Han Sans SC"/>
       <w:color w:val="000000" w:themeColor="text1"/>
     </w:rPr>
     <w:tblPr>
@@ -7104,7 +7104,7 @@
       <w:spacing w:after="0" w:line="240" w:lineRule="auto"/>
     </w:pPr>
     <w:rPr>
-      <w:rFonts w:ascii="Arial Unicode MS" w:hAnsi="Arial Unicode MS" w:eastAsia="Arial Unicode MS"/>
+      <w:rFonts w:ascii="Source Han Sans SC" w:hAnsi="Source Han Sans SC" w:eastAsia="Source Han Sans SC"/>
       <w:color w:val="000000" w:themeColor="text1"/>
     </w:rPr>
     <w:tblPr>
@@ -7189,7 +7189,7 @@
       <w:spacing w:after="0" w:line="240" w:lineRule="auto"/>
     </w:pPr>
     <w:rPr>
-      <w:rFonts w:ascii="Arial Unicode MS" w:hAnsi="Arial Unicode MS" w:eastAsia="Arial Unicode MS"/>
+      <w:rFonts w:ascii="Source Han Sans SC" w:hAnsi="Source Han Sans SC" w:eastAsia="Source Han Sans SC"/>
       <w:color w:val="000000" w:themeColor="text1"/>
     </w:rPr>
     <w:tblPr>
@@ -7274,7 +7274,7 @@
       <w:spacing w:after="0" w:line="240" w:lineRule="auto"/>
     </w:pPr>
     <w:rPr>
-      <w:rFonts w:ascii="Arial Unicode MS" w:hAnsi="Arial Unicode MS" w:eastAsia="Arial Unicode MS"/>
+      <w:rFonts w:ascii="Source Han Sans SC" w:hAnsi="Source Han Sans SC" w:eastAsia="Source Han Sans SC"/>
       <w:color w:val="000000" w:themeColor="text1"/>
     </w:rPr>
     <w:tblPr>
@@ -7359,7 +7359,7 @@
       <w:spacing w:after="0" w:line="240" w:lineRule="auto"/>
     </w:pPr>
     <w:rPr>
-      <w:rFonts w:ascii="Arial Unicode MS" w:hAnsi="Arial Unicode MS" w:eastAsia="Arial Unicode MS"/>
+      <w:rFonts w:ascii="Source Han Sans SC" w:hAnsi="Source Han Sans SC" w:eastAsia="Source Han Sans SC"/>
       <w:color w:val="000000" w:themeColor="text1"/>
     </w:rPr>
     <w:tblPr>
@@ -7444,7 +7444,7 @@
       <w:spacing w:after="0" w:line="240" w:lineRule="auto"/>
     </w:pPr>
     <w:rPr>
-      <w:rFonts w:ascii="Arial Unicode MS" w:hAnsi="Arial Unicode MS" w:eastAsia="Arial Unicode MS"/>
+      <w:rFonts w:ascii="Source Han Sans SC" w:hAnsi="Source Han Sans SC" w:eastAsia="Source Han Sans SC"/>
       <w:color w:val="000000" w:themeColor="text1"/>
     </w:rPr>
     <w:tblPr>
@@ -7529,7 +7529,7 @@
       <w:spacing w:after="0" w:line="240" w:lineRule="auto"/>
     </w:pPr>
     <w:rPr>
-      <w:rFonts w:ascii="Arial Unicode MS" w:hAnsi="Arial Unicode MS" w:eastAsia="Arial Unicode MS"/>
+      <w:rFonts w:ascii="Source Han Sans SC" w:hAnsi="Source Han Sans SC" w:eastAsia="Source Han Sans SC"/>
       <w:color w:val="000000" w:themeColor="text1"/>
     </w:rPr>
     <w:tblPr>
@@ -7614,7 +7614,7 @@
       <w:spacing w:after="0" w:line="240" w:lineRule="auto"/>
     </w:pPr>
     <w:rPr>
-      <w:rFonts w:asciiTheme="majorHAnsi" w:eastAsiaTheme="majorEastAsia" w:hAnsiTheme="majorHAnsi" w:cstheme="majorBidi" w:ascii="Arial Unicode MS" w:hAnsi="Arial Unicode MS" w:eastAsia="Arial Unicode MS"/>
+      <w:rFonts w:asciiTheme="majorHAnsi" w:eastAsiaTheme="majorEastAsia" w:hAnsiTheme="majorHAnsi" w:cstheme="majorBidi" w:ascii="Source Han Sans SC" w:hAnsi="Source Han Sans SC" w:eastAsia="Source Han Sans SC"/>
       <w:color w:val="000000" w:themeColor="text1"/>
     </w:rPr>
     <w:tblPr>
@@ -7742,7 +7742,7 @@
       <w:spacing w:after="0" w:line="240" w:lineRule="auto"/>
     </w:pPr>
     <w:rPr>
-      <w:rFonts w:asciiTheme="majorHAnsi" w:eastAsiaTheme="majorEastAsia" w:hAnsiTheme="majorHAnsi" w:cstheme="majorBidi" w:ascii="Arial Unicode MS" w:hAnsi="Arial Unicode MS" w:eastAsia="Arial Unicode MS"/>
+      <w:rFonts w:asciiTheme="majorHAnsi" w:eastAsiaTheme="majorEastAsia" w:hAnsiTheme="majorHAnsi" w:cstheme="majorBidi" w:ascii="Source Han Sans SC" w:hAnsi="Source Han Sans SC" w:eastAsia="Source Han Sans SC"/>
       <w:color w:val="000000" w:themeColor="text1"/>
     </w:rPr>
     <w:tblPr>
@@ -7870,7 +7870,7 @@
       <w:spacing w:after="0" w:line="240" w:lineRule="auto"/>
     </w:pPr>
     <w:rPr>
-      <w:rFonts w:asciiTheme="majorHAnsi" w:eastAsiaTheme="majorEastAsia" w:hAnsiTheme="majorHAnsi" w:cstheme="majorBidi" w:ascii="Arial Unicode MS" w:hAnsi="Arial Unicode MS" w:eastAsia="Arial Unicode MS"/>
+      <w:rFonts w:asciiTheme="majorHAnsi" w:eastAsiaTheme="majorEastAsia" w:hAnsiTheme="majorHAnsi" w:cstheme="majorBidi" w:ascii="Source Han Sans SC" w:hAnsi="Source Han Sans SC" w:eastAsia="Source Han Sans SC"/>
       <w:color w:val="000000" w:themeColor="text1"/>
     </w:rPr>
     <w:tblPr>
@@ -7998,7 +7998,7 @@
       <w:spacing w:after="0" w:line="240" w:lineRule="auto"/>
     </w:pPr>
     <w:rPr>
-      <w:rFonts w:asciiTheme="majorHAnsi" w:eastAsiaTheme="majorEastAsia" w:hAnsiTheme="majorHAnsi" w:cstheme="majorBidi" w:ascii="Arial Unicode MS" w:hAnsi="Arial Unicode MS" w:eastAsia="Arial Unicode MS"/>
+      <w:rFonts w:asciiTheme="majorHAnsi" w:eastAsiaTheme="majorEastAsia" w:hAnsiTheme="majorHAnsi" w:cstheme="majorBidi" w:ascii="Source Han Sans SC" w:hAnsi="Source Han Sans SC" w:eastAsia="Source Han Sans SC"/>
       <w:color w:val="000000" w:themeColor="text1"/>
     </w:rPr>
     <w:tblPr>
@@ -8126,7 +8126,7 @@
       <w:spacing w:after="0" w:line="240" w:lineRule="auto"/>
     </w:pPr>
     <w:rPr>
-      <w:rFonts w:asciiTheme="majorHAnsi" w:eastAsiaTheme="majorEastAsia" w:hAnsiTheme="majorHAnsi" w:cstheme="majorBidi" w:ascii="Arial Unicode MS" w:hAnsi="Arial Unicode MS" w:eastAsia="Arial Unicode MS"/>
+      <w:rFonts w:asciiTheme="majorHAnsi" w:eastAsiaTheme="majorEastAsia" w:hAnsiTheme="majorHAnsi" w:cstheme="majorBidi" w:ascii="Source Han Sans SC" w:hAnsi="Source Han Sans SC" w:eastAsia="Source Han Sans SC"/>
       <w:color w:val="000000" w:themeColor="text1"/>
     </w:rPr>
     <w:tblPr>
@@ -8254,7 +8254,7 @@
       <w:spacing w:after="0" w:line="240" w:lineRule="auto"/>
     </w:pPr>
     <w:rPr>
-      <w:rFonts w:asciiTheme="majorHAnsi" w:eastAsiaTheme="majorEastAsia" w:hAnsiTheme="majorHAnsi" w:cstheme="majorBidi" w:ascii="Arial Unicode MS" w:hAnsi="Arial Unicode MS" w:eastAsia="Arial Unicode MS"/>
+      <w:rFonts w:asciiTheme="majorHAnsi" w:eastAsiaTheme="majorEastAsia" w:hAnsiTheme="majorHAnsi" w:cstheme="majorBidi" w:ascii="Source Han Sans SC" w:hAnsi="Source Han Sans SC" w:eastAsia="Source Han Sans SC"/>
       <w:color w:val="000000" w:themeColor="text1"/>
     </w:rPr>
     <w:tblPr>
@@ -8382,7 +8382,7 @@
       <w:spacing w:after="0" w:line="240" w:lineRule="auto"/>
     </w:pPr>
     <w:rPr>
-      <w:rFonts w:asciiTheme="majorHAnsi" w:eastAsiaTheme="majorEastAsia" w:hAnsiTheme="majorHAnsi" w:cstheme="majorBidi" w:ascii="Arial Unicode MS" w:hAnsi="Arial Unicode MS" w:eastAsia="Arial Unicode MS"/>
+      <w:rFonts w:asciiTheme="majorHAnsi" w:eastAsiaTheme="majorEastAsia" w:hAnsiTheme="majorHAnsi" w:cstheme="majorBidi" w:ascii="Source Han Sans SC" w:hAnsi="Source Han Sans SC" w:eastAsia="Source Han Sans SC"/>
       <w:color w:val="000000" w:themeColor="text1"/>
     </w:rPr>
     <w:tblPr>
@@ -8510,7 +8510,7 @@
       <w:spacing w:after="0" w:line="240" w:lineRule="auto"/>
     </w:pPr>
     <w:rPr>
-      <w:rFonts w:ascii="Arial Unicode MS" w:hAnsi="Arial Unicode MS" w:eastAsia="Arial Unicode MS"/>
+      <w:rFonts w:ascii="Source Han Sans SC" w:hAnsi="Source Han Sans SC" w:eastAsia="Source Han Sans SC"/>
     </w:rPr>
     <w:tblPr>
       <w:tblStyleRowBandSize w:val="1"/>
@@ -8586,7 +8586,7 @@
       <w:spacing w:after="0" w:line="240" w:lineRule="auto"/>
     </w:pPr>
     <w:rPr>
-      <w:rFonts w:ascii="Arial Unicode MS" w:hAnsi="Arial Unicode MS" w:eastAsia="Arial Unicode MS"/>
+      <w:rFonts w:ascii="Source Han Sans SC" w:hAnsi="Source Han Sans SC" w:eastAsia="Source Han Sans SC"/>
     </w:rPr>
     <w:tblPr>
       <w:tblStyleRowBandSize w:val="1"/>
@@ -8662,7 +8662,7 @@
       <w:spacing w:after="0" w:line="240" w:lineRule="auto"/>
     </w:pPr>
     <w:rPr>
-      <w:rFonts w:ascii="Arial Unicode MS" w:hAnsi="Arial Unicode MS" w:eastAsia="Arial Unicode MS"/>
+      <w:rFonts w:ascii="Source Han Sans SC" w:hAnsi="Source Han Sans SC" w:eastAsia="Source Han Sans SC"/>
     </w:rPr>
     <w:tblPr>
       <w:tblStyleRowBandSize w:val="1"/>
@@ -8738,7 +8738,7 @@
       <w:spacing w:after="0" w:line="240" w:lineRule="auto"/>
     </w:pPr>
     <w:rPr>
-      <w:rFonts w:ascii="Arial Unicode MS" w:hAnsi="Arial Unicode MS" w:eastAsia="Arial Unicode MS"/>
+      <w:rFonts w:ascii="Source Han Sans SC" w:hAnsi="Source Han Sans SC" w:eastAsia="Source Han Sans SC"/>
     </w:rPr>
     <w:tblPr>
       <w:tblStyleRowBandSize w:val="1"/>
@@ -8814,7 +8814,7 @@
       <w:spacing w:after="0" w:line="240" w:lineRule="auto"/>
     </w:pPr>
     <w:rPr>
-      <w:rFonts w:ascii="Arial Unicode MS" w:hAnsi="Arial Unicode MS" w:eastAsia="Arial Unicode MS"/>
+      <w:rFonts w:ascii="Source Han Sans SC" w:hAnsi="Source Han Sans SC" w:eastAsia="Source Han Sans SC"/>
     </w:rPr>
     <w:tblPr>
       <w:tblStyleRowBandSize w:val="1"/>
@@ -8890,7 +8890,7 @@
       <w:spacing w:after="0" w:line="240" w:lineRule="auto"/>
     </w:pPr>
     <w:rPr>
-      <w:rFonts w:ascii="Arial Unicode MS" w:hAnsi="Arial Unicode MS" w:eastAsia="Arial Unicode MS"/>
+      <w:rFonts w:ascii="Source Han Sans SC" w:hAnsi="Source Han Sans SC" w:eastAsia="Source Han Sans SC"/>
     </w:rPr>
     <w:tblPr>
       <w:tblStyleRowBandSize w:val="1"/>
@@ -8966,7 +8966,7 @@
       <w:spacing w:after="0" w:line="240" w:lineRule="auto"/>
     </w:pPr>
     <w:rPr>
-      <w:rFonts w:ascii="Arial Unicode MS" w:hAnsi="Arial Unicode MS" w:eastAsia="Arial Unicode MS"/>
+      <w:rFonts w:ascii="Source Han Sans SC" w:hAnsi="Source Han Sans SC" w:eastAsia="Source Han Sans SC"/>
     </w:rPr>
     <w:tblPr>
       <w:tblStyleRowBandSize w:val="1"/>
@@ -9042,7 +9042,7 @@
       <w:spacing w:after="0" w:line="240" w:lineRule="auto"/>
     </w:pPr>
     <w:rPr>
-      <w:rFonts w:asciiTheme="majorHAnsi" w:eastAsiaTheme="majorEastAsia" w:hAnsiTheme="majorHAnsi" w:cstheme="majorBidi" w:ascii="Arial Unicode MS" w:hAnsi="Arial Unicode MS" w:eastAsia="Arial Unicode MS"/>
+      <w:rFonts w:asciiTheme="majorHAnsi" w:eastAsiaTheme="majorEastAsia" w:hAnsiTheme="majorHAnsi" w:cstheme="majorBidi" w:ascii="Source Han Sans SC" w:hAnsi="Source Han Sans SC" w:eastAsia="Source Han Sans SC"/>
       <w:color w:val="000000" w:themeColor="text1"/>
     </w:rPr>
     <w:tblPr>
@@ -9167,7 +9167,7 @@
       <w:spacing w:after="0" w:line="240" w:lineRule="auto"/>
     </w:pPr>
     <w:rPr>
-      <w:rFonts w:asciiTheme="majorHAnsi" w:eastAsiaTheme="majorEastAsia" w:hAnsiTheme="majorHAnsi" w:cstheme="majorBidi" w:ascii="Arial Unicode MS" w:hAnsi="Arial Unicode MS" w:eastAsia="Arial Unicode MS"/>
+      <w:rFonts w:asciiTheme="majorHAnsi" w:eastAsiaTheme="majorEastAsia" w:hAnsiTheme="majorHAnsi" w:cstheme="majorBidi" w:ascii="Source Han Sans SC" w:hAnsi="Source Han Sans SC" w:eastAsia="Source Han Sans SC"/>
       <w:color w:val="000000" w:themeColor="text1"/>
     </w:rPr>
     <w:tblPr>
@@ -9292,7 +9292,7 @@
       <w:spacing w:after="0" w:line="240" w:lineRule="auto"/>
     </w:pPr>
     <w:rPr>
-      <w:rFonts w:asciiTheme="majorHAnsi" w:eastAsiaTheme="majorEastAsia" w:hAnsiTheme="majorHAnsi" w:cstheme="majorBidi" w:ascii="Arial Unicode MS" w:hAnsi="Arial Unicode MS" w:eastAsia="Arial Unicode MS"/>
+      <w:rFonts w:asciiTheme="majorHAnsi" w:eastAsiaTheme="majorEastAsia" w:hAnsiTheme="majorHAnsi" w:cstheme="majorBidi" w:ascii="Source Han Sans SC" w:hAnsi="Source Han Sans SC" w:eastAsia="Source Han Sans SC"/>
       <w:color w:val="000000" w:themeColor="text1"/>
     </w:rPr>
     <w:tblPr>
@@ -9417,7 +9417,7 @@
       <w:spacing w:after="0" w:line="240" w:lineRule="auto"/>
     </w:pPr>
     <w:rPr>
-      <w:rFonts w:asciiTheme="majorHAnsi" w:eastAsiaTheme="majorEastAsia" w:hAnsiTheme="majorHAnsi" w:cstheme="majorBidi" w:ascii="Arial Unicode MS" w:hAnsi="Arial Unicode MS" w:eastAsia="Arial Unicode MS"/>
+      <w:rFonts w:asciiTheme="majorHAnsi" w:eastAsiaTheme="majorEastAsia" w:hAnsiTheme="majorHAnsi" w:cstheme="majorBidi" w:ascii="Source Han Sans SC" w:hAnsi="Source Han Sans SC" w:eastAsia="Source Han Sans SC"/>
       <w:color w:val="000000" w:themeColor="text1"/>
     </w:rPr>
     <w:tblPr>
@@ -9542,7 +9542,7 @@
       <w:spacing w:after="0" w:line="240" w:lineRule="auto"/>
     </w:pPr>
     <w:rPr>
-      <w:rFonts w:asciiTheme="majorHAnsi" w:eastAsiaTheme="majorEastAsia" w:hAnsiTheme="majorHAnsi" w:cstheme="majorBidi" w:ascii="Arial Unicode MS" w:hAnsi="Arial Unicode MS" w:eastAsia="Arial Unicode MS"/>
+      <w:rFonts w:asciiTheme="majorHAnsi" w:eastAsiaTheme="majorEastAsia" w:hAnsiTheme="majorHAnsi" w:cstheme="majorBidi" w:ascii="Source Han Sans SC" w:hAnsi="Source Han Sans SC" w:eastAsia="Source Han Sans SC"/>
       <w:color w:val="000000" w:themeColor="text1"/>
     </w:rPr>
     <w:tblPr>
@@ -9667,7 +9667,7 @@
       <w:spacing w:after="0" w:line="240" w:lineRule="auto"/>
     </w:pPr>
     <w:rPr>
-      <w:rFonts w:asciiTheme="majorHAnsi" w:eastAsiaTheme="majorEastAsia" w:hAnsiTheme="majorHAnsi" w:cstheme="majorBidi" w:ascii="Arial Unicode MS" w:hAnsi="Arial Unicode MS" w:eastAsia="Arial Unicode MS"/>
+      <w:rFonts w:asciiTheme="majorHAnsi" w:eastAsiaTheme="majorEastAsia" w:hAnsiTheme="majorHAnsi" w:cstheme="majorBidi" w:ascii="Source Han Sans SC" w:hAnsi="Source Han Sans SC" w:eastAsia="Source Han Sans SC"/>
       <w:color w:val="000000" w:themeColor="text1"/>
     </w:rPr>
     <w:tblPr>
@@ -9792,7 +9792,7 @@
       <w:spacing w:after="0" w:line="240" w:lineRule="auto"/>
     </w:pPr>
     <w:rPr>
-      <w:rFonts w:asciiTheme="majorHAnsi" w:eastAsiaTheme="majorEastAsia" w:hAnsiTheme="majorHAnsi" w:cstheme="majorBidi" w:ascii="Arial Unicode MS" w:hAnsi="Arial Unicode MS" w:eastAsia="Arial Unicode MS"/>
+      <w:rFonts w:asciiTheme="majorHAnsi" w:eastAsiaTheme="majorEastAsia" w:hAnsiTheme="majorHAnsi" w:cstheme="majorBidi" w:ascii="Source Han Sans SC" w:hAnsi="Source Han Sans SC" w:eastAsia="Source Han Sans SC"/>
       <w:color w:val="000000" w:themeColor="text1"/>
     </w:rPr>
     <w:tblPr>
@@ -9917,7 +9917,7 @@
       <w:spacing w:after="0" w:line="240" w:lineRule="auto"/>
     </w:pPr>
     <w:rPr>
-      <w:rFonts w:ascii="Arial Unicode MS" w:hAnsi="Arial Unicode MS" w:eastAsia="Arial Unicode MS"/>
+      <w:rFonts w:ascii="Source Han Sans SC" w:hAnsi="Source Han Sans SC" w:eastAsia="Source Han Sans SC"/>
     </w:rPr>
     <w:tblPr>
       <w:tblStyleRowBandSize w:val="1"/>
@@ -10061,7 +10061,7 @@
       <w:spacing w:after="0" w:line="240" w:lineRule="auto"/>
     </w:pPr>
     <w:rPr>
-      <w:rFonts w:ascii="Arial Unicode MS" w:hAnsi="Arial Unicode MS" w:eastAsia="Arial Unicode MS"/>
+      <w:rFonts w:ascii="Source Han Sans SC" w:hAnsi="Source Han Sans SC" w:eastAsia="Source Han Sans SC"/>
     </w:rPr>
     <w:tblPr>
       <w:tblStyleRowBandSize w:val="1"/>
@@ -10205,7 +10205,7 @@
       <w:spacing w:after="0" w:line="240" w:lineRule="auto"/>
     </w:pPr>
     <w:rPr>
-      <w:rFonts w:ascii="Arial Unicode MS" w:hAnsi="Arial Unicode MS" w:eastAsia="Arial Unicode MS"/>
+      <w:rFonts w:ascii="Source Han Sans SC" w:hAnsi="Source Han Sans SC" w:eastAsia="Source Han Sans SC"/>
     </w:rPr>
     <w:tblPr>
       <w:tblStyleRowBandSize w:val="1"/>
@@ -10349,7 +10349,7 @@
       <w:spacing w:after="0" w:line="240" w:lineRule="auto"/>
     </w:pPr>
     <w:rPr>
-      <w:rFonts w:ascii="Arial Unicode MS" w:hAnsi="Arial Unicode MS" w:eastAsia="Arial Unicode MS"/>
+      <w:rFonts w:ascii="Source Han Sans SC" w:hAnsi="Source Han Sans SC" w:eastAsia="Source Han Sans SC"/>
     </w:rPr>
     <w:tblPr>
       <w:tblStyleRowBandSize w:val="1"/>
@@ -10493,7 +10493,7 @@
       <w:spacing w:after="0" w:line="240" w:lineRule="auto"/>
     </w:pPr>
     <w:rPr>
-      <w:rFonts w:ascii="Arial Unicode MS" w:hAnsi="Arial Unicode MS" w:eastAsia="Arial Unicode MS"/>
+      <w:rFonts w:ascii="Source Han Sans SC" w:hAnsi="Source Han Sans SC" w:eastAsia="Source Han Sans SC"/>
     </w:rPr>
     <w:tblPr>
       <w:tblStyleRowBandSize w:val="1"/>
@@ -10637,7 +10637,7 @@
       <w:spacing w:after="0" w:line="240" w:lineRule="auto"/>
     </w:pPr>
     <w:rPr>
-      <w:rFonts w:ascii="Arial Unicode MS" w:hAnsi="Arial Unicode MS" w:eastAsia="Arial Unicode MS"/>
+      <w:rFonts w:ascii="Source Han Sans SC" w:hAnsi="Source Han Sans SC" w:eastAsia="Source Han Sans SC"/>
     </w:rPr>
     <w:tblPr>
       <w:tblStyleRowBandSize w:val="1"/>
@@ -10781,7 +10781,7 @@
       <w:spacing w:after="0" w:line="240" w:lineRule="auto"/>
     </w:pPr>
     <w:rPr>
-      <w:rFonts w:ascii="Arial Unicode MS" w:hAnsi="Arial Unicode MS" w:eastAsia="Arial Unicode MS"/>
+      <w:rFonts w:ascii="Source Han Sans SC" w:hAnsi="Source Han Sans SC" w:eastAsia="Source Han Sans SC"/>
     </w:rPr>
     <w:tblPr>
       <w:tblStyleRowBandSize w:val="1"/>
@@ -10925,7 +10925,7 @@
       <w:spacing w:after="0" w:line="240" w:lineRule="auto"/>
     </w:pPr>
     <w:rPr>
-      <w:rFonts w:ascii="Arial Unicode MS" w:hAnsi="Arial Unicode MS" w:eastAsia="Arial Unicode MS"/>
+      <w:rFonts w:ascii="Source Han Sans SC" w:hAnsi="Source Han Sans SC" w:eastAsia="Source Han Sans SC"/>
       <w:color w:val="FFFFFF" w:themeColor="background1"/>
     </w:rPr>
     <w:tblPr>
@@ -11040,7 +11040,7 @@
       <w:spacing w:after="0" w:line="240" w:lineRule="auto"/>
     </w:pPr>
     <w:rPr>
-      <w:rFonts w:ascii="Arial Unicode MS" w:hAnsi="Arial Unicode MS" w:eastAsia="Arial Unicode MS"/>
+      <w:rFonts w:ascii="Source Han Sans SC" w:hAnsi="Source Han Sans SC" w:eastAsia="Source Han Sans SC"/>
       <w:color w:val="FFFFFF" w:themeColor="background1"/>
     </w:rPr>
     <w:tblPr>
@@ -11155,7 +11155,7 @@
       <w:spacing w:after="0" w:line="240" w:lineRule="auto"/>
     </w:pPr>
     <w:rPr>
-      <w:rFonts w:ascii="Arial Unicode MS" w:hAnsi="Arial Unicode MS" w:eastAsia="Arial Unicode MS"/>
+      <w:rFonts w:ascii="Source Han Sans SC" w:hAnsi="Source Han Sans SC" w:eastAsia="Source Han Sans SC"/>
       <w:color w:val="FFFFFF" w:themeColor="background1"/>
     </w:rPr>
     <w:tblPr>
@@ -11270,7 +11270,7 @@
       <w:spacing w:after="0" w:line="240" w:lineRule="auto"/>
     </w:pPr>
     <w:rPr>
-      <w:rFonts w:ascii="Arial Unicode MS" w:hAnsi="Arial Unicode MS" w:eastAsia="Arial Unicode MS"/>
+      <w:rFonts w:ascii="Source Han Sans SC" w:hAnsi="Source Han Sans SC" w:eastAsia="Source Han Sans SC"/>
       <w:color w:val="FFFFFF" w:themeColor="background1"/>
     </w:rPr>
     <w:tblPr>
@@ -11385,7 +11385,7 @@
       <w:spacing w:after="0" w:line="240" w:lineRule="auto"/>
     </w:pPr>
     <w:rPr>
-      <w:rFonts w:ascii="Arial Unicode MS" w:hAnsi="Arial Unicode MS" w:eastAsia="Arial Unicode MS"/>
+      <w:rFonts w:ascii="Source Han Sans SC" w:hAnsi="Source Han Sans SC" w:eastAsia="Source Han Sans SC"/>
       <w:color w:val="FFFFFF" w:themeColor="background1"/>
     </w:rPr>
     <w:tblPr>
@@ -11500,7 +11500,7 @@
       <w:spacing w:after="0" w:line="240" w:lineRule="auto"/>
     </w:pPr>
     <w:rPr>
-      <w:rFonts w:ascii="Arial Unicode MS" w:hAnsi="Arial Unicode MS" w:eastAsia="Arial Unicode MS"/>
+      <w:rFonts w:ascii="Source Han Sans SC" w:hAnsi="Source Han Sans SC" w:eastAsia="Source Han Sans SC"/>
       <w:color w:val="FFFFFF" w:themeColor="background1"/>
     </w:rPr>
     <w:tblPr>
@@ -11615,7 +11615,7 @@
       <w:spacing w:after="0" w:line="240" w:lineRule="auto"/>
     </w:pPr>
     <w:rPr>
-      <w:rFonts w:ascii="Arial Unicode MS" w:hAnsi="Arial Unicode MS" w:eastAsia="Arial Unicode MS"/>
+      <w:rFonts w:ascii="Source Han Sans SC" w:hAnsi="Source Han Sans SC" w:eastAsia="Source Han Sans SC"/>
       <w:color w:val="FFFFFF" w:themeColor="background1"/>
     </w:rPr>
     <w:tblPr>
@@ -11730,7 +11730,7 @@
       <w:spacing w:after="0" w:line="240" w:lineRule="auto"/>
     </w:pPr>
     <w:rPr>
-      <w:rFonts w:ascii="Arial Unicode MS" w:hAnsi="Arial Unicode MS" w:eastAsia="Arial Unicode MS"/>
+      <w:rFonts w:ascii="Source Han Sans SC" w:hAnsi="Source Han Sans SC" w:eastAsia="Source Han Sans SC"/>
       <w:color w:val="000000" w:themeColor="text1"/>
     </w:rPr>
     <w:tblPr>
@@ -11853,7 +11853,7 @@
       <w:spacing w:after="0" w:line="240" w:lineRule="auto"/>
     </w:pPr>
     <w:rPr>
-      <w:rFonts w:ascii="Arial Unicode MS" w:hAnsi="Arial Unicode MS" w:eastAsia="Arial Unicode MS"/>
+      <w:rFonts w:ascii="Source Han Sans SC" w:hAnsi="Source Han Sans SC" w:eastAsia="Source Han Sans SC"/>
       <w:color w:val="000000" w:themeColor="text1"/>
     </w:rPr>
     <w:tblPr>
@@ -11976,7 +11976,7 @@
       <w:spacing w:after="0" w:line="240" w:lineRule="auto"/>
     </w:pPr>
     <w:rPr>
-      <w:rFonts w:ascii="Arial Unicode MS" w:hAnsi="Arial Unicode MS" w:eastAsia="Arial Unicode MS"/>
+      <w:rFonts w:ascii="Source Han Sans SC" w:hAnsi="Source Han Sans SC" w:eastAsia="Source Han Sans SC"/>
       <w:color w:val="000000" w:themeColor="text1"/>
     </w:rPr>
     <w:tblPr>
@@ -12099,7 +12099,7 @@
       <w:spacing w:after="0" w:line="240" w:lineRule="auto"/>
     </w:pPr>
     <w:rPr>
-      <w:rFonts w:ascii="Arial Unicode MS" w:hAnsi="Arial Unicode MS" w:eastAsia="Arial Unicode MS"/>
+      <w:rFonts w:ascii="Source Han Sans SC" w:hAnsi="Source Han Sans SC" w:eastAsia="Source Han Sans SC"/>
       <w:color w:val="000000" w:themeColor="text1"/>
     </w:rPr>
     <w:tblPr>
@@ -12212,7 +12212,7 @@
       <w:spacing w:after="0" w:line="240" w:lineRule="auto"/>
     </w:pPr>
     <w:rPr>
-      <w:rFonts w:ascii="Arial Unicode MS" w:hAnsi="Arial Unicode MS" w:eastAsia="Arial Unicode MS"/>
+      <w:rFonts w:ascii="Source Han Sans SC" w:hAnsi="Source Han Sans SC" w:eastAsia="Source Han Sans SC"/>
       <w:color w:val="000000" w:themeColor="text1"/>
     </w:rPr>
     <w:tblPr>
@@ -12335,7 +12335,7 @@
       <w:spacing w:after="0" w:line="240" w:lineRule="auto"/>
     </w:pPr>
     <w:rPr>
-      <w:rFonts w:ascii="Arial Unicode MS" w:hAnsi="Arial Unicode MS" w:eastAsia="Arial Unicode MS"/>
+      <w:rFonts w:ascii="Source Han Sans SC" w:hAnsi="Source Han Sans SC" w:eastAsia="Source Han Sans SC"/>
       <w:color w:val="000000" w:themeColor="text1"/>
     </w:rPr>
     <w:tblPr>
@@ -12458,7 +12458,7 @@
       <w:spacing w:after="0" w:line="240" w:lineRule="auto"/>
     </w:pPr>
     <w:rPr>
-      <w:rFonts w:ascii="Arial Unicode MS" w:hAnsi="Arial Unicode MS" w:eastAsia="Arial Unicode MS"/>
+      <w:rFonts w:ascii="Source Han Sans SC" w:hAnsi="Source Han Sans SC" w:eastAsia="Source Han Sans SC"/>
       <w:color w:val="000000" w:themeColor="text1"/>
     </w:rPr>
     <w:tblPr>
@@ -12581,7 +12581,7 @@
       <w:spacing w:after="0" w:line="240" w:lineRule="auto"/>
     </w:pPr>
     <w:rPr>
-      <w:rFonts w:ascii="Arial Unicode MS" w:hAnsi="Arial Unicode MS" w:eastAsia="Arial Unicode MS"/>
+      <w:rFonts w:ascii="Source Han Sans SC" w:hAnsi="Source Han Sans SC" w:eastAsia="Source Han Sans SC"/>
       <w:color w:val="000000" w:themeColor="text1"/>
     </w:rPr>
     <w:tblPr>
@@ -12668,7 +12668,7 @@
       <w:spacing w:after="0" w:line="240" w:lineRule="auto"/>
     </w:pPr>
     <w:rPr>
-      <w:rFonts w:ascii="Arial Unicode MS" w:hAnsi="Arial Unicode MS" w:eastAsia="Arial Unicode MS"/>
+      <w:rFonts w:ascii="Source Han Sans SC" w:hAnsi="Source Han Sans SC" w:eastAsia="Source Han Sans SC"/>
       <w:color w:val="000000" w:themeColor="text1"/>
     </w:rPr>
     <w:tblPr>
@@ -12755,7 +12755,7 @@
       <w:spacing w:after="0" w:line="240" w:lineRule="auto"/>
     </w:pPr>
     <w:rPr>
-      <w:rFonts w:ascii="Arial Unicode MS" w:hAnsi="Arial Unicode MS" w:eastAsia="Arial Unicode MS"/>
+      <w:rFonts w:ascii="Source Han Sans SC" w:hAnsi="Source Han Sans SC" w:eastAsia="Source Han Sans SC"/>
       <w:color w:val="000000" w:themeColor="text1"/>
     </w:rPr>
     <w:tblPr>
@@ -12842,7 +12842,7 @@
       <w:spacing w:after="0" w:line="240" w:lineRule="auto"/>
     </w:pPr>
     <w:rPr>
-      <w:rFonts w:ascii="Arial Unicode MS" w:hAnsi="Arial Unicode MS" w:eastAsia="Arial Unicode MS"/>
+      <w:rFonts w:ascii="Source Han Sans SC" w:hAnsi="Source Han Sans SC" w:eastAsia="Source Han Sans SC"/>
       <w:color w:val="000000" w:themeColor="text1"/>
     </w:rPr>
     <w:tblPr>
@@ -12929,7 +12929,7 @@
       <w:spacing w:after="0" w:line="240" w:lineRule="auto"/>
     </w:pPr>
     <w:rPr>
-      <w:rFonts w:ascii="Arial Unicode MS" w:hAnsi="Arial Unicode MS" w:eastAsia="Arial Unicode MS"/>
+      <w:rFonts w:ascii="Source Han Sans SC" w:hAnsi="Source Han Sans SC" w:eastAsia="Source Han Sans SC"/>
       <w:color w:val="000000" w:themeColor="text1"/>
     </w:rPr>
     <w:tblPr>
@@ -13016,7 +13016,7 @@
       <w:spacing w:after="0" w:line="240" w:lineRule="auto"/>
     </w:pPr>
     <w:rPr>
-      <w:rFonts w:ascii="Arial Unicode MS" w:hAnsi="Arial Unicode MS" w:eastAsia="Arial Unicode MS"/>
+      <w:rFonts w:ascii="Source Han Sans SC" w:hAnsi="Source Han Sans SC" w:eastAsia="Source Han Sans SC"/>
       <w:color w:val="000000" w:themeColor="text1"/>
     </w:rPr>
     <w:tblPr>
@@ -13103,7 +13103,7 @@
       <w:spacing w:after="0" w:line="240" w:lineRule="auto"/>
     </w:pPr>
     <w:rPr>
-      <w:rFonts w:ascii="Arial Unicode MS" w:hAnsi="Arial Unicode MS" w:eastAsia="Arial Unicode MS"/>
+      <w:rFonts w:ascii="Source Han Sans SC" w:hAnsi="Source Han Sans SC" w:eastAsia="Source Han Sans SC"/>
       <w:color w:val="000000" w:themeColor="text1"/>
     </w:rPr>
     <w:tblPr>
@@ -13190,7 +13190,7 @@
       <w:spacing w:after="0" w:line="240" w:lineRule="auto"/>
     </w:pPr>
     <w:rPr>
-      <w:rFonts w:ascii="Arial Unicode MS" w:hAnsi="Arial Unicode MS" w:eastAsia="Arial Unicode MS"/>
+      <w:rFonts w:ascii="Source Han Sans SC" w:hAnsi="Source Han Sans SC" w:eastAsia="Source Han Sans SC"/>
       <w:color w:val="000000" w:themeColor="text1"/>
     </w:rPr>
     <w:tblPr>
@@ -13271,7 +13271,7 @@
       <w:spacing w:after="0" w:line="240" w:lineRule="auto"/>
     </w:pPr>
     <w:rPr>
-      <w:rFonts w:ascii="Arial Unicode MS" w:hAnsi="Arial Unicode MS" w:eastAsia="Arial Unicode MS"/>
+      <w:rFonts w:ascii="Source Han Sans SC" w:hAnsi="Source Han Sans SC" w:eastAsia="Source Han Sans SC"/>
       <w:color w:val="000000" w:themeColor="text1"/>
     </w:rPr>
     <w:tblPr>
@@ -13352,7 +13352,7 @@
       <w:spacing w:after="0" w:line="240" w:lineRule="auto"/>
     </w:pPr>
     <w:rPr>
-      <w:rFonts w:ascii="Arial Unicode MS" w:hAnsi="Arial Unicode MS" w:eastAsia="Arial Unicode MS"/>
+      <w:rFonts w:ascii="Source Han Sans SC" w:hAnsi="Source Han Sans SC" w:eastAsia="Source Han Sans SC"/>
       <w:color w:val="000000" w:themeColor="text1"/>
     </w:rPr>
     <w:tblPr>
@@ -13433,7 +13433,7 @@
       <w:spacing w:after="0" w:line="240" w:lineRule="auto"/>
     </w:pPr>
     <w:rPr>
-      <w:rFonts w:ascii="Arial Unicode MS" w:hAnsi="Arial Unicode MS" w:eastAsia="Arial Unicode MS"/>
+      <w:rFonts w:ascii="Source Han Sans SC" w:hAnsi="Source Han Sans SC" w:eastAsia="Source Han Sans SC"/>
       <w:color w:val="000000" w:themeColor="text1"/>
     </w:rPr>
     <w:tblPr>
@@ -13514,7 +13514,7 @@
       <w:spacing w:after="0" w:line="240" w:lineRule="auto"/>
     </w:pPr>
     <w:rPr>
-      <w:rFonts w:ascii="Arial Unicode MS" w:hAnsi="Arial Unicode MS" w:eastAsia="Arial Unicode MS"/>
+      <w:rFonts w:ascii="Source Han Sans SC" w:hAnsi="Source Han Sans SC" w:eastAsia="Source Han Sans SC"/>
       <w:color w:val="000000" w:themeColor="text1"/>
     </w:rPr>
     <w:tblPr>
@@ -13595,7 +13595,7 @@
       <w:spacing w:after="0" w:line="240" w:lineRule="auto"/>
     </w:pPr>
     <w:rPr>
-      <w:rFonts w:ascii="Arial Unicode MS" w:hAnsi="Arial Unicode MS" w:eastAsia="Arial Unicode MS"/>
+      <w:rFonts w:ascii="Source Han Sans SC" w:hAnsi="Source Han Sans SC" w:eastAsia="Source Han Sans SC"/>
       <w:color w:val="000000" w:themeColor="text1"/>
     </w:rPr>
     <w:tblPr>
@@ -13676,7 +13676,7 @@
       <w:spacing w:after="0" w:line="240" w:lineRule="auto"/>
     </w:pPr>
     <w:rPr>
-      <w:rFonts w:ascii="Arial Unicode MS" w:hAnsi="Arial Unicode MS" w:eastAsia="Arial Unicode MS"/>
+      <w:rFonts w:ascii="Source Han Sans SC" w:hAnsi="Source Han Sans SC" w:eastAsia="Source Han Sans SC"/>
       <w:color w:val="000000" w:themeColor="text1"/>
     </w:rPr>
     <w:tblPr>

</xml_diff>